<commit_message>
Risuzione 81% serial print
</commit_message>
<xml_diff>
--- a/SMS Manager for Power monitoring.docx
+++ b/SMS Manager for Power monitoring.docx
@@ -9595,7 +9595,16 @@
                 <w:szCs w:val="16"/>
                 <w:lang w:val="en-US" w:eastAsia="it-IT"/>
               </w:rPr>
-              <w:t>1.0</w:t>
+              <w:t>1.</w:t>
+            </w:r>
+            <w:r>
+              <w:rPr>
+                <w:rFonts w:ascii="Arial" w:eastAsia="Times New Roman" w:hAnsi="Arial" w:cs="Arial"/>
+                <w:sz w:val="16"/>
+                <w:szCs w:val="16"/>
+                <w:lang w:val="en-US" w:eastAsia="it-IT"/>
+              </w:rPr>
+              <w:t>2</w:t>
             </w:r>
           </w:p>
         </w:tc>
@@ -9644,25 +9653,14 @@
                 <w:lang w:eastAsia="it-IT"/>
               </w:rPr>
             </w:pPr>
-            <w:proofErr w:type="spellStart"/>
-            <w:r>
-              <w:rPr>
-                <w:rFonts w:ascii="Arial" w:eastAsia="Times New Roman" w:hAnsi="Arial" w:cs="Arial"/>
-                <w:sz w:val="16"/>
-                <w:szCs w:val="16"/>
-                <w:lang w:eastAsia="it-IT"/>
-              </w:rPr>
-              <w:t>Factory</w:t>
-            </w:r>
-            <w:proofErr w:type="spellEnd"/>
-            <w:r>
-              <w:rPr>
-                <w:rFonts w:ascii="Arial" w:eastAsia="Times New Roman" w:hAnsi="Arial" w:cs="Arial"/>
-                <w:sz w:val="16"/>
-                <w:szCs w:val="16"/>
-                <w:lang w:eastAsia="it-IT"/>
-              </w:rPr>
-              <w:t xml:space="preserve"> Reset</w:t>
+            <w:r>
+              <w:rPr>
+                <w:rFonts w:ascii="Arial" w:eastAsia="Times New Roman" w:hAnsi="Arial" w:cs="Arial"/>
+                <w:sz w:val="16"/>
+                <w:szCs w:val="16"/>
+                <w:lang w:eastAsia="it-IT"/>
+              </w:rPr>
+              <w:t>Ritorna i numeri autorizzati</w:t>
             </w:r>
           </w:p>
         </w:tc>
@@ -9690,28 +9688,7 @@
                 <w:szCs w:val="16"/>
                 <w:lang w:eastAsia="it-IT"/>
               </w:rPr>
-              <w:t>Power On</w:t>
-            </w:r>
-          </w:p>
-          <w:p>
-            <w:pPr>
-              <w:spacing w:line="330" w:lineRule="atLeast"/>
-              <w:jc w:val="center"/>
-              <w:rPr>
-                <w:rFonts w:ascii="Arial" w:eastAsia="Times New Roman" w:hAnsi="Arial" w:cs="Arial"/>
-                <w:sz w:val="16"/>
-                <w:szCs w:val="16"/>
-                <w:lang w:eastAsia="it-IT"/>
-              </w:rPr>
-            </w:pPr>
-            <w:r>
-              <w:rPr>
-                <w:rFonts w:ascii="Arial" w:eastAsia="Times New Roman" w:hAnsi="Arial" w:cs="Arial"/>
-                <w:sz w:val="16"/>
-                <w:szCs w:val="16"/>
-                <w:lang w:eastAsia="it-IT"/>
-              </w:rPr>
-              <w:t>Nel caso esista già un numero MASTER precaricato – solo testing</w:t>
+              <w:t>Solo da Tel. MASTER</w:t>
             </w:r>
           </w:p>
         </w:tc>
@@ -9727,30 +9704,23 @@
               <w:jc w:val="center"/>
               <w:rPr>
                 <w:rFonts w:ascii="Arial" w:eastAsia="Times New Roman" w:hAnsi="Arial" w:cs="Arial"/>
-                <w:sz w:val="16"/>
-                <w:szCs w:val="16"/>
-                <w:lang w:eastAsia="it-IT"/>
-              </w:rPr>
-            </w:pPr>
-            <w:r>
-              <w:rPr>
-                <w:rFonts w:ascii="Arial" w:eastAsia="Times New Roman" w:hAnsi="Arial" w:cs="Arial"/>
                 <w:b/>
                 <w:bCs/>
                 <w:sz w:val="16"/>
                 <w:szCs w:val="16"/>
                 <w:lang w:eastAsia="it-IT"/>
               </w:rPr>
-              <w:t>F</w:t>
-            </w:r>
-            <w:r>
-              <w:rPr>
-                <w:rFonts w:ascii="Arial" w:eastAsia="Times New Roman" w:hAnsi="Arial" w:cs="Arial"/>
-                <w:sz w:val="16"/>
-                <w:szCs w:val="16"/>
-                <w:lang w:eastAsia="it-IT"/>
-              </w:rPr>
-              <w:t>12345</w:t>
+            </w:pPr>
+            <w:r>
+              <w:rPr>
+                <w:rFonts w:ascii="Arial" w:eastAsia="Times New Roman" w:hAnsi="Arial" w:cs="Arial"/>
+                <w:b/>
+                <w:bCs/>
+                <w:sz w:val="16"/>
+                <w:szCs w:val="16"/>
+                <w:lang w:eastAsia="it-IT"/>
+              </w:rPr>
+              <w:t>N</w:t>
             </w:r>
           </w:p>
         </w:tc>
@@ -9777,7 +9747,7 @@
                 <w:szCs w:val="16"/>
                 <w:lang w:val="en-US" w:eastAsia="it-IT"/>
               </w:rPr>
-              <w:t>SMS:</w:t>
+              <w:t xml:space="preserve">SMS: </w:t>
             </w:r>
           </w:p>
           <w:p>
@@ -9797,7 +9767,74 @@
                 <w:szCs w:val="16"/>
                 <w:lang w:val="en-US" w:eastAsia="it-IT"/>
               </w:rPr>
-              <w:t>"ALL NUMBERS DELETED &amp; PIN SET TO FACTORY"</w:t>
+              <w:t>”Authorized phone n." con:</w:t>
+            </w:r>
+          </w:p>
+          <w:p>
+            <w:pPr>
+              <w:spacing w:line="330" w:lineRule="atLeast"/>
+              <w:rPr>
+                <w:rFonts w:ascii="Arial" w:eastAsia="Times New Roman" w:hAnsi="Arial" w:cs="Arial"/>
+                <w:sz w:val="16"/>
+                <w:szCs w:val="16"/>
+                <w:lang w:eastAsia="it-IT"/>
+              </w:rPr>
+            </w:pPr>
+            <w:r>
+              <w:rPr>
+                <w:rFonts w:ascii="Arial" w:eastAsia="Times New Roman" w:hAnsi="Arial" w:cs="Arial"/>
+                <w:sz w:val="16"/>
+                <w:szCs w:val="16"/>
+                <w:lang w:eastAsia="it-IT"/>
+              </w:rPr>
+              <w:t>solo n</w:t>
+            </w:r>
+            <w:r>
+              <w:rPr>
+                <w:rFonts w:ascii="Arial" w:eastAsia="Times New Roman" w:hAnsi="Arial" w:cs="Arial"/>
+                <w:sz w:val="16"/>
+                <w:szCs w:val="16"/>
+                <w:lang w:eastAsia="it-IT"/>
+              </w:rPr>
+              <w:t xml:space="preserve">umero </w:t>
+            </w:r>
+            <w:r>
+              <w:rPr>
+                <w:rFonts w:ascii="Arial" w:eastAsia="Times New Roman" w:hAnsi="Arial" w:cs="Arial"/>
+                <w:sz w:val="16"/>
+                <w:szCs w:val="16"/>
+                <w:lang w:eastAsia="it-IT"/>
+              </w:rPr>
+              <w:t xml:space="preserve">telefonico del </w:t>
+            </w:r>
+            <w:r>
+              <w:rPr>
+                <w:rFonts w:ascii="Arial" w:eastAsia="Times New Roman" w:hAnsi="Arial" w:cs="Arial"/>
+                <w:sz w:val="16"/>
+                <w:szCs w:val="16"/>
+                <w:lang w:eastAsia="it-IT"/>
+              </w:rPr>
+              <w:t>Master</w:t>
+            </w:r>
+          </w:p>
+          <w:p>
+            <w:pPr>
+              <w:spacing w:line="330" w:lineRule="atLeast"/>
+              <w:rPr>
+                <w:rFonts w:ascii="Arial" w:eastAsia="Times New Roman" w:hAnsi="Arial" w:cs="Arial"/>
+                <w:sz w:val="16"/>
+                <w:szCs w:val="16"/>
+                <w:lang w:eastAsia="it-IT"/>
+              </w:rPr>
+            </w:pPr>
+            <w:r>
+              <w:rPr>
+                <w:rFonts w:ascii="Arial" w:eastAsia="Times New Roman" w:hAnsi="Arial" w:cs="Arial"/>
+                <w:sz w:val="16"/>
+                <w:szCs w:val="16"/>
+                <w:lang w:eastAsia="it-IT"/>
+              </w:rPr>
+              <w:t>Verifica presenza n. telefonico MASTER</w:t>
             </w:r>
           </w:p>
         </w:tc>
@@ -9815,7 +9852,7 @@
                 <w:rFonts w:ascii="Arial" w:eastAsia="Times New Roman" w:hAnsi="Arial" w:cs="Arial"/>
                 <w:sz w:val="16"/>
                 <w:szCs w:val="16"/>
-                <w:lang w:val="en-US" w:eastAsia="it-IT"/>
+                <w:lang w:eastAsia="it-IT"/>
               </w:rPr>
             </w:pPr>
           </w:p>
@@ -9828,6 +9865,260 @@
         <w:tc>
           <w:tcPr>
             <w:tcW w:w="704" w:type="dxa"/>
+            <w:shd w:val="clear" w:color="auto" w:fill="A6A6A6" w:themeFill="background1" w:themeFillShade="A6"/>
+            <w:vAlign w:val="center"/>
+          </w:tcPr>
+          <w:p>
+            <w:pPr>
+              <w:spacing w:line="330" w:lineRule="atLeast"/>
+              <w:jc w:val="center"/>
+              <w:rPr>
+                <w:rFonts w:ascii="Arial" w:eastAsia="Times New Roman" w:hAnsi="Arial" w:cs="Arial"/>
+                <w:sz w:val="16"/>
+                <w:szCs w:val="16"/>
+                <w:lang w:val="en-US" w:eastAsia="it-IT"/>
+              </w:rPr>
+            </w:pPr>
+            <w:r>
+              <w:rPr>
+                <w:rFonts w:ascii="Arial" w:eastAsia="Times New Roman" w:hAnsi="Arial" w:cs="Arial"/>
+                <w:sz w:val="16"/>
+                <w:szCs w:val="16"/>
+                <w:lang w:val="en-US" w:eastAsia="it-IT"/>
+              </w:rPr>
+              <w:t>1.0</w:t>
+            </w:r>
+          </w:p>
+        </w:tc>
+        <w:tc>
+          <w:tcPr>
+            <w:tcW w:w="1559" w:type="dxa"/>
+            <w:shd w:val="clear" w:color="auto" w:fill="A6A6A6" w:themeFill="background1" w:themeFillShade="A6"/>
+            <w:vAlign w:val="center"/>
+          </w:tcPr>
+          <w:p>
+            <w:pPr>
+              <w:spacing w:line="330" w:lineRule="atLeast"/>
+              <w:jc w:val="center"/>
+              <w:rPr>
+                <w:rFonts w:ascii="Arial" w:eastAsia="Times New Roman" w:hAnsi="Arial" w:cs="Arial"/>
+                <w:sz w:val="16"/>
+                <w:szCs w:val="16"/>
+                <w:lang w:eastAsia="it-IT"/>
+              </w:rPr>
+            </w:pPr>
+            <w:r>
+              <w:rPr>
+                <w:rFonts w:ascii="Arial" w:eastAsia="Times New Roman" w:hAnsi="Arial" w:cs="Arial"/>
+                <w:sz w:val="16"/>
+                <w:szCs w:val="16"/>
+                <w:lang w:eastAsia="it-IT"/>
+              </w:rPr>
+              <w:t>Primi LAB TESTS</w:t>
+            </w:r>
+          </w:p>
+        </w:tc>
+        <w:tc>
+          <w:tcPr>
+            <w:tcW w:w="3828" w:type="dxa"/>
+            <w:shd w:val="clear" w:color="auto" w:fill="A6A6A6" w:themeFill="background1" w:themeFillShade="A6"/>
+            <w:vAlign w:val="center"/>
+          </w:tcPr>
+          <w:p>
+            <w:pPr>
+              <w:spacing w:line="330" w:lineRule="atLeast"/>
+              <w:jc w:val="center"/>
+              <w:rPr>
+                <w:rFonts w:ascii="Arial" w:eastAsia="Times New Roman" w:hAnsi="Arial" w:cs="Arial"/>
+                <w:sz w:val="16"/>
+                <w:szCs w:val="16"/>
+                <w:lang w:eastAsia="it-IT"/>
+              </w:rPr>
+            </w:pPr>
+            <w:proofErr w:type="spellStart"/>
+            <w:r>
+              <w:rPr>
+                <w:rFonts w:ascii="Arial" w:eastAsia="Times New Roman" w:hAnsi="Arial" w:cs="Arial"/>
+                <w:sz w:val="16"/>
+                <w:szCs w:val="16"/>
+                <w:lang w:eastAsia="it-IT"/>
+              </w:rPr>
+              <w:t>Factory</w:t>
+            </w:r>
+            <w:proofErr w:type="spellEnd"/>
+            <w:r>
+              <w:rPr>
+                <w:rFonts w:ascii="Arial" w:eastAsia="Times New Roman" w:hAnsi="Arial" w:cs="Arial"/>
+                <w:sz w:val="16"/>
+                <w:szCs w:val="16"/>
+                <w:lang w:eastAsia="it-IT"/>
+              </w:rPr>
+              <w:t xml:space="preserve"> Reset</w:t>
+            </w:r>
+          </w:p>
+        </w:tc>
+        <w:tc>
+          <w:tcPr>
+            <w:tcW w:w="2409" w:type="dxa"/>
+            <w:shd w:val="clear" w:color="auto" w:fill="A6A6A6" w:themeFill="background1" w:themeFillShade="A6"/>
+            <w:vAlign w:val="center"/>
+          </w:tcPr>
+          <w:p>
+            <w:pPr>
+              <w:spacing w:line="330" w:lineRule="atLeast"/>
+              <w:jc w:val="center"/>
+              <w:rPr>
+                <w:rFonts w:ascii="Arial" w:eastAsia="Times New Roman" w:hAnsi="Arial" w:cs="Arial"/>
+                <w:sz w:val="16"/>
+                <w:szCs w:val="16"/>
+                <w:lang w:eastAsia="it-IT"/>
+              </w:rPr>
+            </w:pPr>
+            <w:r>
+              <w:rPr>
+                <w:rFonts w:ascii="Arial" w:eastAsia="Times New Roman" w:hAnsi="Arial" w:cs="Arial"/>
+                <w:sz w:val="16"/>
+                <w:szCs w:val="16"/>
+                <w:lang w:eastAsia="it-IT"/>
+              </w:rPr>
+              <w:t>Power On</w:t>
+            </w:r>
+          </w:p>
+          <w:p>
+            <w:pPr>
+              <w:spacing w:line="330" w:lineRule="atLeast"/>
+              <w:jc w:val="center"/>
+              <w:rPr>
+                <w:rFonts w:ascii="Arial" w:eastAsia="Times New Roman" w:hAnsi="Arial" w:cs="Arial"/>
+                <w:sz w:val="16"/>
+                <w:szCs w:val="16"/>
+                <w:lang w:eastAsia="it-IT"/>
+              </w:rPr>
+            </w:pPr>
+            <w:r>
+              <w:rPr>
+                <w:rFonts w:ascii="Arial" w:eastAsia="Times New Roman" w:hAnsi="Arial" w:cs="Arial"/>
+                <w:sz w:val="16"/>
+                <w:szCs w:val="16"/>
+                <w:lang w:eastAsia="it-IT"/>
+              </w:rPr>
+              <w:t>Nel caso esista già un numero MASTER precaricato – solo testing</w:t>
+            </w:r>
+          </w:p>
+        </w:tc>
+        <w:tc>
+          <w:tcPr>
+            <w:tcW w:w="1701" w:type="dxa"/>
+            <w:shd w:val="clear" w:color="auto" w:fill="A6A6A6" w:themeFill="background1" w:themeFillShade="A6"/>
+            <w:vAlign w:val="center"/>
+          </w:tcPr>
+          <w:p>
+            <w:pPr>
+              <w:spacing w:line="330" w:lineRule="atLeast"/>
+              <w:jc w:val="center"/>
+              <w:rPr>
+                <w:rFonts w:ascii="Arial" w:eastAsia="Times New Roman" w:hAnsi="Arial" w:cs="Arial"/>
+                <w:sz w:val="16"/>
+                <w:szCs w:val="16"/>
+                <w:lang w:eastAsia="it-IT"/>
+              </w:rPr>
+            </w:pPr>
+            <w:r>
+              <w:rPr>
+                <w:rFonts w:ascii="Arial" w:eastAsia="Times New Roman" w:hAnsi="Arial" w:cs="Arial"/>
+                <w:b/>
+                <w:bCs/>
+                <w:sz w:val="16"/>
+                <w:szCs w:val="16"/>
+                <w:lang w:eastAsia="it-IT"/>
+              </w:rPr>
+              <w:t>F</w:t>
+            </w:r>
+            <w:r>
+              <w:rPr>
+                <w:rFonts w:ascii="Arial" w:eastAsia="Times New Roman" w:hAnsi="Arial" w:cs="Arial"/>
+                <w:sz w:val="16"/>
+                <w:szCs w:val="16"/>
+                <w:lang w:eastAsia="it-IT"/>
+              </w:rPr>
+              <w:t>12345</w:t>
+            </w:r>
+          </w:p>
+        </w:tc>
+        <w:tc>
+          <w:tcPr>
+            <w:tcW w:w="3828" w:type="dxa"/>
+            <w:shd w:val="clear" w:color="auto" w:fill="A6A6A6" w:themeFill="background1" w:themeFillShade="A6"/>
+            <w:vAlign w:val="center"/>
+          </w:tcPr>
+          <w:p>
+            <w:pPr>
+              <w:spacing w:line="330" w:lineRule="atLeast"/>
+              <w:rPr>
+                <w:rFonts w:ascii="Arial" w:eastAsia="Times New Roman" w:hAnsi="Arial" w:cs="Arial"/>
+                <w:sz w:val="16"/>
+                <w:szCs w:val="16"/>
+                <w:lang w:val="en-US" w:eastAsia="it-IT"/>
+              </w:rPr>
+            </w:pPr>
+            <w:r>
+              <w:rPr>
+                <w:rFonts w:ascii="Arial" w:eastAsia="Times New Roman" w:hAnsi="Arial" w:cs="Arial"/>
+                <w:sz w:val="16"/>
+                <w:szCs w:val="16"/>
+                <w:lang w:val="en-US" w:eastAsia="it-IT"/>
+              </w:rPr>
+              <w:t>SMS:</w:t>
+            </w:r>
+          </w:p>
+          <w:p>
+            <w:pPr>
+              <w:spacing w:line="330" w:lineRule="atLeast"/>
+              <w:rPr>
+                <w:rFonts w:ascii="Arial" w:eastAsia="Times New Roman" w:hAnsi="Arial" w:cs="Arial"/>
+                <w:sz w:val="16"/>
+                <w:szCs w:val="16"/>
+                <w:lang w:val="en-US" w:eastAsia="it-IT"/>
+              </w:rPr>
+            </w:pPr>
+            <w:r>
+              <w:rPr>
+                <w:rFonts w:ascii="Arial" w:eastAsia="Times New Roman" w:hAnsi="Arial" w:cs="Arial"/>
+                <w:sz w:val="16"/>
+                <w:szCs w:val="16"/>
+                <w:lang w:val="en-US" w:eastAsia="it-IT"/>
+              </w:rPr>
+              <w:t>"ALL NUMBERS DELETED &amp; PIN SET TO FACTORY"</w:t>
+            </w:r>
+          </w:p>
+        </w:tc>
+        <w:tc>
+          <w:tcPr>
+            <w:tcW w:w="992" w:type="dxa"/>
+            <w:shd w:val="clear" w:color="auto" w:fill="FFFFFF" w:themeFill="background1"/>
+            <w:vAlign w:val="center"/>
+          </w:tcPr>
+          <w:p>
+            <w:pPr>
+              <w:spacing w:line="330" w:lineRule="atLeast"/>
+              <w:jc w:val="center"/>
+              <w:rPr>
+                <w:rFonts w:ascii="Arial" w:eastAsia="Times New Roman" w:hAnsi="Arial" w:cs="Arial"/>
+                <w:sz w:val="16"/>
+                <w:szCs w:val="16"/>
+                <w:lang w:val="en-US" w:eastAsia="it-IT"/>
+              </w:rPr>
+            </w:pPr>
+          </w:p>
+        </w:tc>
+      </w:tr>
+      <w:tr>
+        <w:trPr>
+          <w:jc w:val="center"/>
+        </w:trPr>
+        <w:tc>
+          <w:tcPr>
+            <w:tcW w:w="704" w:type="dxa"/>
             <w:shd w:val="clear" w:color="auto" w:fill="FFC000"/>
             <w:vAlign w:val="center"/>
           </w:tcPr>
@@ -11472,6 +11763,7 @@
                 <w:szCs w:val="16"/>
                 <w:lang w:eastAsia="it-IT"/>
               </w:rPr>
+              <w:lastRenderedPageBreak/>
               <w:t>solo n</w:t>
             </w:r>
             <w:r>
@@ -11796,7 +12088,6 @@
                 <w:szCs w:val="16"/>
                 <w:lang w:eastAsia="it-IT"/>
               </w:rPr>
-              <w:lastRenderedPageBreak/>
               <w:t>2.</w:t>
             </w:r>
             <w:r>
@@ -14539,6 +14830,7 @@
                 <w:szCs w:val="16"/>
                 <w:lang w:eastAsia="it-IT"/>
               </w:rPr>
+              <w:lastRenderedPageBreak/>
               <w:t>4.4</w:t>
             </w:r>
           </w:p>
@@ -14777,7 +15069,6 @@
                 <w:szCs w:val="16"/>
                 <w:lang w:val="en-US" w:eastAsia="it-IT"/>
               </w:rPr>
-              <w:lastRenderedPageBreak/>
               <w:t>4.5</w:t>
             </w:r>
           </w:p>

</xml_diff>

<commit_message>
Aggiunte DEFINE condizionali di compilazione
</commit_message>
<xml_diff>
--- a/SMS Manager for Power monitoring.docx
+++ b/SMS Manager for Power monitoring.docx
@@ -66,7 +66,6 @@
         </w:rPr>
         <w:t xml:space="preserve">  </w:t>
       </w:r>
-      <w:proofErr w:type="spellStart"/>
       <w:r>
         <w:rPr>
           <w:rFonts w:ascii="Arial" w:eastAsia="Times New Roman" w:hAnsi="Arial" w:cs="Arial"/>
@@ -77,20 +76,39 @@
           <w:szCs w:val="28"/>
           <w:lang w:val="en-US" w:eastAsia="it-IT"/>
         </w:rPr>
-        <w:t>Specifiche</w:t>
-      </w:r>
-      <w:proofErr w:type="spellEnd"/>
-      <w:r>
-        <w:rPr>
-          <w:rFonts w:ascii="Arial" w:eastAsia="Times New Roman" w:hAnsi="Arial" w:cs="Arial"/>
-          <w:b/>
-          <w:bCs/>
-          <w:color w:val="000000" w:themeColor="text1"/>
-          <w:sz w:val="28"/>
-          <w:szCs w:val="28"/>
+        <w:t>Specifiche:</w:t>
+      </w:r>
+    </w:p>
+    <w:p>
+      <w:pPr>
+        <w:spacing w:after="240" w:line="330" w:lineRule="atLeast"/>
+        <w:rPr>
+          <w:rFonts w:ascii="Arial" w:eastAsia="Times New Roman" w:hAnsi="Arial" w:cs="Arial"/>
+          <w:color w:val="000000" w:themeColor="text1"/>
+          <w:sz w:val="24"/>
+          <w:szCs w:val="24"/>
+          <w:lang w:eastAsia="it-IT"/>
+        </w:rPr>
+      </w:pPr>
+      <w:r>
+        <w:rPr>
+          <w:rFonts w:ascii="Arial" w:eastAsia="Times New Roman" w:hAnsi="Arial" w:cs="Arial"/>
+          <w:color w:val="000000" w:themeColor="text1"/>
+          <w:sz w:val="24"/>
+          <w:szCs w:val="24"/>
           <w:lang w:val="en-US" w:eastAsia="it-IT"/>
         </w:rPr>
-        <w:t>:</w:t>
+        <w:t xml:space="preserve">  </w:t>
+      </w:r>
+      <w:r>
+        <w:rPr>
+          <w:rFonts w:ascii="Arial" w:eastAsia="Times New Roman" w:hAnsi="Arial" w:cs="Arial"/>
+          <w:color w:val="000000" w:themeColor="text1"/>
+          <w:sz w:val="24"/>
+          <w:szCs w:val="24"/>
+          <w:lang w:eastAsia="it-IT"/>
+        </w:rPr>
+        <w:t>-     Verifica corretta registrazione</w:t>
       </w:r>
     </w:p>
     <w:p>
@@ -110,63 +128,9 @@
           <w:color w:val="000000" w:themeColor="text1"/>
           <w:sz w:val="24"/>
           <w:szCs w:val="24"/>
-          <w:lang w:val="en-US" w:eastAsia="it-IT"/>
-        </w:rPr>
-        <w:t xml:space="preserve">  </w:t>
-      </w:r>
-      <w:r>
-        <w:rPr>
-          <w:rFonts w:ascii="Arial" w:eastAsia="Times New Roman" w:hAnsi="Arial" w:cs="Arial"/>
-          <w:color w:val="000000" w:themeColor="text1"/>
-          <w:sz w:val="24"/>
-          <w:szCs w:val="24"/>
-          <w:lang w:eastAsia="it-IT"/>
-        </w:rPr>
-        <w:t>-     Verifica corretta registrazione</w:t>
-      </w:r>
-    </w:p>
-    <w:p>
-      <w:pPr>
-        <w:spacing w:after="240" w:line="330" w:lineRule="atLeast"/>
-        <w:rPr>
-          <w:rFonts w:ascii="Arial" w:eastAsia="Times New Roman" w:hAnsi="Arial" w:cs="Arial"/>
-          <w:color w:val="000000" w:themeColor="text1"/>
-          <w:sz w:val="24"/>
-          <w:szCs w:val="24"/>
-          <w:lang w:eastAsia="it-IT"/>
-        </w:rPr>
-      </w:pPr>
-      <w:r>
-        <w:rPr>
-          <w:rFonts w:ascii="Arial" w:eastAsia="Times New Roman" w:hAnsi="Arial" w:cs="Arial"/>
-          <w:color w:val="000000" w:themeColor="text1"/>
-          <w:sz w:val="24"/>
-          <w:szCs w:val="24"/>
-          <w:lang w:eastAsia="it-IT"/>
-        </w:rPr>
-        <w:t>  -     </w:t>
-      </w:r>
-      <w:proofErr w:type="spellStart"/>
-      <w:r>
-        <w:rPr>
-          <w:rFonts w:ascii="Arial" w:eastAsia="Times New Roman" w:hAnsi="Arial" w:cs="Arial"/>
-          <w:color w:val="000000" w:themeColor="text1"/>
-          <w:sz w:val="24"/>
-          <w:szCs w:val="24"/>
-          <w:lang w:eastAsia="it-IT"/>
-        </w:rPr>
-        <w:t>Reinizializzazione</w:t>
-      </w:r>
-      <w:proofErr w:type="spellEnd"/>
-      <w:r>
-        <w:rPr>
-          <w:rFonts w:ascii="Arial" w:eastAsia="Times New Roman" w:hAnsi="Arial" w:cs="Arial"/>
-          <w:color w:val="000000" w:themeColor="text1"/>
-          <w:sz w:val="24"/>
-          <w:szCs w:val="24"/>
-          <w:lang w:eastAsia="it-IT"/>
-        </w:rPr>
-        <w:t xml:space="preserve"> ogni 24 ore (ogni giorno) ad ora prestabilita</w:t>
+          <w:lang w:eastAsia="it-IT"/>
+        </w:rPr>
+        <w:t>  -     Reinizializzazione ogni 24 ore (ogni giorno) ad ora prestabilita</w:t>
       </w:r>
       <w:r>
         <w:rPr>
@@ -728,29 +692,7 @@
           <w:szCs w:val="24"/>
           <w:lang w:eastAsia="it-IT"/>
         </w:rPr>
-        <w:t xml:space="preserve">su comando M (per definizione Master da vuoto) o </w:t>
-      </w:r>
-      <w:proofErr w:type="spellStart"/>
-      <w:r>
-        <w:rPr>
-          <w:rFonts w:ascii="Arial" w:eastAsia="Times New Roman" w:hAnsi="Arial" w:cs="Arial"/>
-          <w:color w:val="000000" w:themeColor="text1"/>
-          <w:sz w:val="24"/>
-          <w:szCs w:val="24"/>
-          <w:lang w:eastAsia="it-IT"/>
-        </w:rPr>
-        <w:t>factory</w:t>
-      </w:r>
-      <w:proofErr w:type="spellEnd"/>
-      <w:r>
-        <w:rPr>
-          <w:rFonts w:ascii="Arial" w:eastAsia="Times New Roman" w:hAnsi="Arial" w:cs="Arial"/>
-          <w:color w:val="000000" w:themeColor="text1"/>
-          <w:sz w:val="24"/>
-          <w:szCs w:val="24"/>
-          <w:lang w:eastAsia="it-IT"/>
-        </w:rPr>
-        <w:t xml:space="preserve"> reset da comando M</w:t>
+        <w:t>su comando M (per definizione Master da vuoto) o factory reset da comando M</w:t>
       </w:r>
     </w:p>
     <w:p>
@@ -854,7 +796,6 @@
         </w:rPr>
         <w:t xml:space="preserve"> Comando SMS (</w:t>
       </w:r>
-      <w:proofErr w:type="spellStart"/>
       <w:r>
         <w:rPr>
           <w:rFonts w:ascii="Arial" w:eastAsia="Times New Roman" w:hAnsi="Arial" w:cs="Arial"/>
@@ -885,7 +826,6 @@
         </w:rPr>
         <w:t>PinVecchio+PinNuovo</w:t>
       </w:r>
-      <w:proofErr w:type="spellEnd"/>
       <w:r>
         <w:rPr>
           <w:rFonts w:ascii="Arial" w:eastAsia="Times New Roman" w:hAnsi="Arial" w:cs="Arial"/>
@@ -967,27 +907,15 @@
         </w:rPr>
         <w:t xml:space="preserve">(NON Implementato)    Salvataggio STATO </w:t>
       </w:r>
-      <w:proofErr w:type="spellStart"/>
-      <w:r>
-        <w:rPr>
-          <w:rFonts w:ascii="Arial" w:eastAsia="Times New Roman" w:hAnsi="Arial" w:cs="Arial"/>
-          <w:color w:val="000000" w:themeColor="text1"/>
-          <w:sz w:val="24"/>
-          <w:szCs w:val="24"/>
-          <w:lang w:eastAsia="it-IT"/>
-        </w:rPr>
-        <w:t>Pwr</w:t>
-      </w:r>
-      <w:proofErr w:type="spellEnd"/>
-      <w:r>
-        <w:rPr>
-          <w:rFonts w:ascii="Arial" w:eastAsia="Times New Roman" w:hAnsi="Arial" w:cs="Arial"/>
-          <w:color w:val="000000" w:themeColor="text1"/>
-          <w:sz w:val="24"/>
-          <w:szCs w:val="24"/>
-          <w:lang w:eastAsia="it-IT"/>
-        </w:rPr>
-        <w:t xml:space="preserve"> </w:t>
+      <w:r>
+        <w:rPr>
+          <w:rFonts w:ascii="Arial" w:eastAsia="Times New Roman" w:hAnsi="Arial" w:cs="Arial"/>
+          <w:color w:val="000000" w:themeColor="text1"/>
+          <w:sz w:val="24"/>
+          <w:szCs w:val="24"/>
+          <w:lang w:eastAsia="it-IT"/>
+        </w:rPr>
+        <w:t xml:space="preserve">Pwr </w:t>
       </w:r>
       <w:r>
         <w:rPr>
@@ -1181,29 +1109,7 @@
           <w:szCs w:val="24"/>
           <w:lang w:eastAsia="it-IT"/>
         </w:rPr>
-        <w:t xml:space="preserve">- Monitora la tensione di rete tramite un trasformatore e la libreria </w:t>
-      </w:r>
-      <w:proofErr w:type="spellStart"/>
-      <w:r>
-        <w:rPr>
-          <w:rFonts w:ascii="Arial" w:eastAsia="Times New Roman" w:hAnsi="Arial" w:cs="Arial"/>
-          <w:color w:val="000000" w:themeColor="text1"/>
-          <w:sz w:val="24"/>
-          <w:szCs w:val="24"/>
-          <w:lang w:eastAsia="it-IT"/>
-        </w:rPr>
-        <w:t>EmonLib</w:t>
-      </w:r>
-      <w:proofErr w:type="spellEnd"/>
-      <w:r>
-        <w:rPr>
-          <w:rFonts w:ascii="Arial" w:eastAsia="Times New Roman" w:hAnsi="Arial" w:cs="Arial"/>
-          <w:color w:val="000000" w:themeColor="text1"/>
-          <w:sz w:val="24"/>
-          <w:szCs w:val="24"/>
-          <w:lang w:eastAsia="it-IT"/>
-        </w:rPr>
-        <w:t>.</w:t>
+        <w:t>- Monitora la tensione di rete tramite un trasformatore e la libreria EmonLib.</w:t>
       </w:r>
     </w:p>
     <w:p>
@@ -1897,29 +1803,7 @@
           <w:szCs w:val="24"/>
           <w:lang w:eastAsia="it-IT"/>
         </w:rPr>
-        <w:t xml:space="preserve"> </w:t>
-      </w:r>
-      <w:proofErr w:type="spellStart"/>
-      <w:r>
-        <w:rPr>
-          <w:rFonts w:ascii="Arial" w:eastAsia="Times New Roman" w:hAnsi="Arial" w:cs="Arial"/>
-          <w:color w:val="000000" w:themeColor="text1"/>
-          <w:sz w:val="24"/>
-          <w:szCs w:val="24"/>
-          <w:lang w:eastAsia="it-IT"/>
-        </w:rPr>
-        <w:t>Factory</w:t>
-      </w:r>
-      <w:proofErr w:type="spellEnd"/>
-      <w:r>
-        <w:rPr>
-          <w:rFonts w:ascii="Arial" w:eastAsia="Times New Roman" w:hAnsi="Arial" w:cs="Arial"/>
-          <w:color w:val="000000" w:themeColor="text1"/>
-          <w:sz w:val="24"/>
-          <w:szCs w:val="24"/>
-          <w:lang w:eastAsia="it-IT"/>
-        </w:rPr>
-        <w:t xml:space="preserve"> reset - </w:t>
+        <w:t xml:space="preserve"> Factory reset - </w:t>
       </w:r>
       <w:r>
         <w:rPr>
@@ -3379,10 +3263,12 @@
           <w:szCs w:val="24"/>
           <w:lang w:val="en-US" w:eastAsia="it-IT"/>
         </w:rPr>
-        <w:t xml:space="preserve">n. </w:t>
-      </w:r>
-      <w:proofErr w:type="spellStart"/>
-      <w:r>
+        <w:t>n. telefono:</w:t>
+      </w:r>
+    </w:p>
+    <w:p>
+      <w:pPr>
+        <w:spacing w:after="240" w:line="330" w:lineRule="atLeast"/>
         <w:rPr>
           <w:rFonts w:ascii="Arial" w:eastAsia="Times New Roman" w:hAnsi="Arial" w:cs="Arial"/>
           <w:i/>
@@ -3392,9 +3278,7 @@
           <w:szCs w:val="24"/>
           <w:lang w:val="en-US" w:eastAsia="it-IT"/>
         </w:rPr>
-        <w:t>telefono</w:t>
-      </w:r>
-      <w:proofErr w:type="spellEnd"/>
+      </w:pPr>
       <w:r>
         <w:rPr>
           <w:rFonts w:ascii="Arial" w:eastAsia="Times New Roman" w:hAnsi="Arial" w:cs="Arial"/>
@@ -3405,7 +3289,7 @@
           <w:szCs w:val="24"/>
           <w:lang w:val="en-US" w:eastAsia="it-IT"/>
         </w:rPr>
-        <w:t>:</w:t>
+        <w:t>write_String((12+i*16), "");</w:t>
       </w:r>
     </w:p>
     <w:p>
@@ -3421,7 +3305,6 @@
           <w:lang w:val="en-US" w:eastAsia="it-IT"/>
         </w:rPr>
       </w:pPr>
-      <w:proofErr w:type="spellStart"/>
       <w:r>
         <w:rPr>
           <w:rFonts w:ascii="Arial" w:eastAsia="Times New Roman" w:hAnsi="Arial" w:cs="Arial"/>
@@ -3432,10 +3315,169 @@
           <w:szCs w:val="24"/>
           <w:lang w:val="en-US" w:eastAsia="it-IT"/>
         </w:rPr>
-        <w:t>write_String</w:t>
-      </w:r>
-      <w:proofErr w:type="spellEnd"/>
-      <w:r>
+        <w:t>write_StringTel((EPTELIN+i*EPTELPRO), "");</w:t>
+      </w:r>
+    </w:p>
+    <w:p>
+      <w:pPr>
+        <w:spacing w:after="240" w:line="330" w:lineRule="atLeast"/>
+        <w:rPr>
+          <w:rFonts w:ascii="Arial" w:eastAsia="Times New Roman" w:hAnsi="Arial" w:cs="Arial"/>
+          <w:color w:val="000000" w:themeColor="text1"/>
+          <w:sz w:val="24"/>
+          <w:szCs w:val="24"/>
+          <w:lang w:val="en-US" w:eastAsia="it-IT"/>
+        </w:rPr>
+      </w:pPr>
+    </w:p>
+    <w:p>
+      <w:pPr>
+        <w:spacing w:after="240" w:line="330" w:lineRule="atLeast"/>
+        <w:rPr>
+          <w:rFonts w:ascii="Arial" w:eastAsia="Times New Roman" w:hAnsi="Arial" w:cs="Arial"/>
+          <w:color w:val="000000" w:themeColor="text1"/>
+          <w:sz w:val="24"/>
+          <w:szCs w:val="24"/>
+          <w:lang w:eastAsia="it-IT"/>
+        </w:rPr>
+      </w:pPr>
+      <w:r>
+        <w:rPr>
+          <w:rFonts w:ascii="Arial" w:eastAsia="Times New Roman" w:hAnsi="Arial" w:cs="Arial"/>
+          <w:color w:val="000000" w:themeColor="text1"/>
+          <w:sz w:val="24"/>
+          <w:szCs w:val="24"/>
+          <w:lang w:eastAsia="it-IT"/>
+        </w:rPr>
+        <w:t>con EPTELIN=12 ed EPTELPRO=16:</w:t>
+      </w:r>
+    </w:p>
+    <w:p>
+      <w:pPr>
+        <w:spacing w:after="240" w:line="330" w:lineRule="atLeast"/>
+        <w:rPr>
+          <w:rFonts w:ascii="Arial" w:eastAsia="Times New Roman" w:hAnsi="Arial" w:cs="Arial"/>
+          <w:color w:val="000000" w:themeColor="text1"/>
+          <w:sz w:val="24"/>
+          <w:szCs w:val="24"/>
+          <w:lang w:eastAsia="it-IT"/>
+        </w:rPr>
+      </w:pPr>
+      <w:r>
+        <w:rPr>
+          <w:rFonts w:ascii="Arial" w:eastAsia="Times New Roman" w:hAnsi="Arial" w:cs="Arial"/>
+          <w:color w:val="000000" w:themeColor="text1"/>
+          <w:sz w:val="24"/>
+          <w:szCs w:val="24"/>
+          <w:lang w:eastAsia="it-IT"/>
+        </w:rPr>
+        <w:t>        I         I- F      Profondità</w:t>
+      </w:r>
+    </w:p>
+    <w:p>
+      <w:pPr>
+        <w:spacing w:after="240" w:line="330" w:lineRule="atLeast"/>
+        <w:rPr>
+          <w:rFonts w:ascii="Arial" w:eastAsia="Times New Roman" w:hAnsi="Arial" w:cs="Arial"/>
+          <w:color w:val="000000" w:themeColor="text1"/>
+          <w:sz w:val="24"/>
+          <w:szCs w:val="24"/>
+          <w:lang w:eastAsia="it-IT"/>
+        </w:rPr>
+      </w:pPr>
+      <w:r>
+        <w:rPr>
+          <w:rFonts w:ascii="Arial" w:eastAsia="Times New Roman" w:hAnsi="Arial" w:cs="Arial"/>
+          <w:color w:val="000000" w:themeColor="text1"/>
+          <w:sz w:val="24"/>
+          <w:szCs w:val="24"/>
+          <w:lang w:eastAsia="it-IT"/>
+        </w:rPr>
+        <w:t>0 12+0 12   Inizio MASTER   12-27     16  (14 cifre+"+"+"\0")=16 caratteri</w:t>
+      </w:r>
+    </w:p>
+    <w:p>
+      <w:pPr>
+        <w:spacing w:after="240" w:line="330" w:lineRule="atLeast"/>
+        <w:rPr>
+          <w:rFonts w:ascii="Arial" w:eastAsia="Times New Roman" w:hAnsi="Arial" w:cs="Arial"/>
+          <w:color w:val="000000" w:themeColor="text1"/>
+          <w:sz w:val="24"/>
+          <w:szCs w:val="24"/>
+          <w:lang w:eastAsia="it-IT"/>
+        </w:rPr>
+      </w:pPr>
+      <w:r>
+        <w:rPr>
+          <w:rFonts w:ascii="Arial" w:eastAsia="Times New Roman" w:hAnsi="Arial" w:cs="Arial"/>
+          <w:color w:val="000000" w:themeColor="text1"/>
+          <w:sz w:val="24"/>
+          <w:szCs w:val="24"/>
+          <w:lang w:eastAsia="it-IT"/>
+        </w:rPr>
+        <w:lastRenderedPageBreak/>
+        <w:t>1 12+16 28  Inizio A1       28-43     16</w:t>
+      </w:r>
+    </w:p>
+    <w:p>
+      <w:pPr>
+        <w:spacing w:after="240" w:line="330" w:lineRule="atLeast"/>
+        <w:rPr>
+          <w:rFonts w:ascii="Arial" w:eastAsia="Times New Roman" w:hAnsi="Arial" w:cs="Arial"/>
+          <w:color w:val="000000" w:themeColor="text1"/>
+          <w:sz w:val="24"/>
+          <w:szCs w:val="24"/>
+          <w:lang w:eastAsia="it-IT"/>
+        </w:rPr>
+      </w:pPr>
+      <w:r>
+        <w:rPr>
+          <w:rFonts w:ascii="Arial" w:eastAsia="Times New Roman" w:hAnsi="Arial" w:cs="Arial"/>
+          <w:color w:val="000000" w:themeColor="text1"/>
+          <w:sz w:val="24"/>
+          <w:szCs w:val="24"/>
+          <w:lang w:eastAsia="it-IT"/>
+        </w:rPr>
+        <w:t>2 12+32 44  Inizio A2       44-59     16</w:t>
+      </w:r>
+    </w:p>
+    <w:p>
+      <w:pPr>
+        <w:spacing w:after="240" w:line="330" w:lineRule="atLeast"/>
+        <w:rPr>
+          <w:rFonts w:ascii="Arial" w:eastAsia="Times New Roman" w:hAnsi="Arial" w:cs="Arial"/>
+          <w:color w:val="000000" w:themeColor="text1"/>
+          <w:sz w:val="24"/>
+          <w:szCs w:val="24"/>
+          <w:lang w:eastAsia="it-IT"/>
+        </w:rPr>
+      </w:pPr>
+      <w:r>
+        <w:rPr>
+          <w:rFonts w:ascii="Arial" w:eastAsia="Times New Roman" w:hAnsi="Arial" w:cs="Arial"/>
+          <w:color w:val="000000" w:themeColor="text1"/>
+          <w:sz w:val="24"/>
+          <w:szCs w:val="24"/>
+          <w:lang w:eastAsia="it-IT"/>
+        </w:rPr>
+        <w:t>3 12+48 60  Inizio A3       60-75     16</w:t>
+      </w:r>
+    </w:p>
+    <w:p>
+      <w:pPr>
+        <w:spacing w:after="240" w:line="330" w:lineRule="atLeast"/>
+        <w:rPr>
+          <w:rFonts w:ascii="Arial" w:eastAsia="Times New Roman" w:hAnsi="Arial" w:cs="Arial"/>
+          <w:color w:val="000000" w:themeColor="text1"/>
+          <w:sz w:val="24"/>
+          <w:szCs w:val="24"/>
+          <w:lang w:eastAsia="it-IT"/>
+        </w:rPr>
+      </w:pPr>
+    </w:p>
+    <w:p>
+      <w:pPr>
+        <w:spacing w:after="240" w:line="330" w:lineRule="atLeast"/>
         <w:rPr>
           <w:rFonts w:ascii="Arial" w:eastAsia="Times New Roman" w:hAnsi="Arial" w:cs="Arial"/>
           <w:i/>
@@ -3443,14 +3485,10 @@
           <w:color w:val="000000" w:themeColor="text1"/>
           <w:sz w:val="24"/>
           <w:szCs w:val="24"/>
-          <w:lang w:val="en-US" w:eastAsia="it-IT"/>
-        </w:rPr>
-        <w:t>((12+i*16), "");</w:t>
-      </w:r>
-    </w:p>
-    <w:p>
-      <w:pPr>
-        <w:spacing w:after="240" w:line="330" w:lineRule="atLeast"/>
+          <w:lang w:eastAsia="it-IT"/>
+        </w:rPr>
+      </w:pPr>
+      <w:r>
         <w:rPr>
           <w:rFonts w:ascii="Arial" w:eastAsia="Times New Roman" w:hAnsi="Arial" w:cs="Arial"/>
           <w:i/>
@@ -3458,11 +3496,14 @@
           <w:color w:val="000000" w:themeColor="text1"/>
           <w:sz w:val="24"/>
           <w:szCs w:val="24"/>
-          <w:lang w:val="en-US" w:eastAsia="it-IT"/>
-        </w:rPr>
-      </w:pPr>
-      <w:proofErr w:type="spellStart"/>
-      <w:r>
+          <w:lang w:eastAsia="it-IT"/>
+        </w:rPr>
+        <w:t>OLD</w:t>
+      </w:r>
+    </w:p>
+    <w:p>
+      <w:pPr>
+        <w:spacing w:after="240" w:line="330" w:lineRule="atLeast"/>
         <w:rPr>
           <w:rFonts w:ascii="Arial" w:eastAsia="Times New Roman" w:hAnsi="Arial" w:cs="Arial"/>
           <w:i/>
@@ -3470,11 +3511,9 @@
           <w:color w:val="000000" w:themeColor="text1"/>
           <w:sz w:val="24"/>
           <w:szCs w:val="24"/>
-          <w:lang w:val="en-US" w:eastAsia="it-IT"/>
-        </w:rPr>
-        <w:t>write_StringTel</w:t>
-      </w:r>
-      <w:proofErr w:type="spellEnd"/>
+          <w:lang w:eastAsia="it-IT"/>
+        </w:rPr>
+      </w:pPr>
       <w:r>
         <w:rPr>
           <w:rFonts w:ascii="Arial" w:eastAsia="Times New Roman" w:hAnsi="Arial" w:cs="Arial"/>
@@ -3483,258 +3522,9 @@
           <w:color w:val="000000" w:themeColor="text1"/>
           <w:sz w:val="24"/>
           <w:szCs w:val="24"/>
-          <w:lang w:val="en-US" w:eastAsia="it-IT"/>
-        </w:rPr>
-        <w:t>((</w:t>
-      </w:r>
-      <w:proofErr w:type="spellStart"/>
-      <w:r>
-        <w:rPr>
-          <w:rFonts w:ascii="Arial" w:eastAsia="Times New Roman" w:hAnsi="Arial" w:cs="Arial"/>
-          <w:i/>
-          <w:iCs/>
-          <w:color w:val="000000" w:themeColor="text1"/>
-          <w:sz w:val="24"/>
-          <w:szCs w:val="24"/>
-          <w:lang w:val="en-US" w:eastAsia="it-IT"/>
-        </w:rPr>
-        <w:t>EPTELIN+i</w:t>
-      </w:r>
-      <w:proofErr w:type="spellEnd"/>
-      <w:r>
-        <w:rPr>
-          <w:rFonts w:ascii="Arial" w:eastAsia="Times New Roman" w:hAnsi="Arial" w:cs="Arial"/>
-          <w:i/>
-          <w:iCs/>
-          <w:color w:val="000000" w:themeColor="text1"/>
-          <w:sz w:val="24"/>
-          <w:szCs w:val="24"/>
-          <w:lang w:val="en-US" w:eastAsia="it-IT"/>
-        </w:rPr>
-        <w:t>*EPTELPRO), "");</w:t>
-      </w:r>
-    </w:p>
-    <w:p>
-      <w:pPr>
-        <w:spacing w:after="240" w:line="330" w:lineRule="atLeast"/>
-        <w:rPr>
-          <w:rFonts w:ascii="Arial" w:eastAsia="Times New Roman" w:hAnsi="Arial" w:cs="Arial"/>
-          <w:color w:val="000000" w:themeColor="text1"/>
-          <w:sz w:val="24"/>
-          <w:szCs w:val="24"/>
-          <w:lang w:val="en-US" w:eastAsia="it-IT"/>
-        </w:rPr>
-      </w:pPr>
-    </w:p>
-    <w:p>
-      <w:pPr>
-        <w:spacing w:after="240" w:line="330" w:lineRule="atLeast"/>
-        <w:rPr>
-          <w:rFonts w:ascii="Arial" w:eastAsia="Times New Roman" w:hAnsi="Arial" w:cs="Arial"/>
-          <w:color w:val="000000" w:themeColor="text1"/>
-          <w:sz w:val="24"/>
-          <w:szCs w:val="24"/>
-          <w:lang w:eastAsia="it-IT"/>
-        </w:rPr>
-      </w:pPr>
-      <w:r>
-        <w:rPr>
-          <w:rFonts w:ascii="Arial" w:eastAsia="Times New Roman" w:hAnsi="Arial" w:cs="Arial"/>
-          <w:color w:val="000000" w:themeColor="text1"/>
-          <w:sz w:val="24"/>
-          <w:szCs w:val="24"/>
-          <w:lang w:eastAsia="it-IT"/>
-        </w:rPr>
-        <w:t>con EPTELIN=12 ed EPTELPRO=16:</w:t>
-      </w:r>
-    </w:p>
-    <w:p>
-      <w:pPr>
-        <w:spacing w:after="240" w:line="330" w:lineRule="atLeast"/>
-        <w:rPr>
-          <w:rFonts w:ascii="Arial" w:eastAsia="Times New Roman" w:hAnsi="Arial" w:cs="Arial"/>
-          <w:color w:val="000000" w:themeColor="text1"/>
-          <w:sz w:val="24"/>
-          <w:szCs w:val="24"/>
-          <w:lang w:eastAsia="it-IT"/>
-        </w:rPr>
-      </w:pPr>
-      <w:r>
-        <w:rPr>
-          <w:rFonts w:ascii="Arial" w:eastAsia="Times New Roman" w:hAnsi="Arial" w:cs="Arial"/>
-          <w:color w:val="000000" w:themeColor="text1"/>
-          <w:sz w:val="24"/>
-          <w:szCs w:val="24"/>
-          <w:lang w:eastAsia="it-IT"/>
-        </w:rPr>
-        <w:t>        I         I- F      Profondità</w:t>
-      </w:r>
-    </w:p>
-    <w:p>
-      <w:pPr>
-        <w:spacing w:after="240" w:line="330" w:lineRule="atLeast"/>
-        <w:rPr>
-          <w:rFonts w:ascii="Arial" w:eastAsia="Times New Roman" w:hAnsi="Arial" w:cs="Arial"/>
-          <w:color w:val="000000" w:themeColor="text1"/>
-          <w:sz w:val="24"/>
-          <w:szCs w:val="24"/>
-          <w:lang w:eastAsia="it-IT"/>
-        </w:rPr>
-      </w:pPr>
-      <w:r>
-        <w:rPr>
-          <w:rFonts w:ascii="Arial" w:eastAsia="Times New Roman" w:hAnsi="Arial" w:cs="Arial"/>
-          <w:color w:val="000000" w:themeColor="text1"/>
-          <w:sz w:val="24"/>
-          <w:szCs w:val="24"/>
-          <w:lang w:eastAsia="it-IT"/>
-        </w:rPr>
-        <w:t>0 12+0 12   Inizio MASTER   12-27     16  (14 cifre+"+"+"\0")=16 caratteri</w:t>
-      </w:r>
-    </w:p>
-    <w:p>
-      <w:pPr>
-        <w:spacing w:after="240" w:line="330" w:lineRule="atLeast"/>
-        <w:rPr>
-          <w:rFonts w:ascii="Arial" w:eastAsia="Times New Roman" w:hAnsi="Arial" w:cs="Arial"/>
-          <w:color w:val="000000" w:themeColor="text1"/>
-          <w:sz w:val="24"/>
-          <w:szCs w:val="24"/>
-          <w:lang w:eastAsia="it-IT"/>
-        </w:rPr>
-      </w:pPr>
-      <w:r>
-        <w:rPr>
-          <w:rFonts w:ascii="Arial" w:eastAsia="Times New Roman" w:hAnsi="Arial" w:cs="Arial"/>
-          <w:color w:val="000000" w:themeColor="text1"/>
-          <w:sz w:val="24"/>
-          <w:szCs w:val="24"/>
-          <w:lang w:eastAsia="it-IT"/>
-        </w:rPr>
-        <w:lastRenderedPageBreak/>
-        <w:t>1 12+16 28  Inizio A1       28-43     16</w:t>
-      </w:r>
-    </w:p>
-    <w:p>
-      <w:pPr>
-        <w:spacing w:after="240" w:line="330" w:lineRule="atLeast"/>
-        <w:rPr>
-          <w:rFonts w:ascii="Arial" w:eastAsia="Times New Roman" w:hAnsi="Arial" w:cs="Arial"/>
-          <w:color w:val="000000" w:themeColor="text1"/>
-          <w:sz w:val="24"/>
-          <w:szCs w:val="24"/>
-          <w:lang w:eastAsia="it-IT"/>
-        </w:rPr>
-      </w:pPr>
-      <w:r>
-        <w:rPr>
-          <w:rFonts w:ascii="Arial" w:eastAsia="Times New Roman" w:hAnsi="Arial" w:cs="Arial"/>
-          <w:color w:val="000000" w:themeColor="text1"/>
-          <w:sz w:val="24"/>
-          <w:szCs w:val="24"/>
-          <w:lang w:eastAsia="it-IT"/>
-        </w:rPr>
-        <w:t>2 12+32 44  Inizio A2       44-59     16</w:t>
-      </w:r>
-    </w:p>
-    <w:p>
-      <w:pPr>
-        <w:spacing w:after="240" w:line="330" w:lineRule="atLeast"/>
-        <w:rPr>
-          <w:rFonts w:ascii="Arial" w:eastAsia="Times New Roman" w:hAnsi="Arial" w:cs="Arial"/>
-          <w:color w:val="000000" w:themeColor="text1"/>
-          <w:sz w:val="24"/>
-          <w:szCs w:val="24"/>
-          <w:lang w:eastAsia="it-IT"/>
-        </w:rPr>
-      </w:pPr>
-      <w:r>
-        <w:rPr>
-          <w:rFonts w:ascii="Arial" w:eastAsia="Times New Roman" w:hAnsi="Arial" w:cs="Arial"/>
-          <w:color w:val="000000" w:themeColor="text1"/>
-          <w:sz w:val="24"/>
-          <w:szCs w:val="24"/>
-          <w:lang w:eastAsia="it-IT"/>
-        </w:rPr>
-        <w:t>3 12+48 60  Inizio A3       60-75     16</w:t>
-      </w:r>
-    </w:p>
-    <w:p>
-      <w:pPr>
-        <w:spacing w:after="240" w:line="330" w:lineRule="atLeast"/>
-        <w:rPr>
-          <w:rFonts w:ascii="Arial" w:eastAsia="Times New Roman" w:hAnsi="Arial" w:cs="Arial"/>
-          <w:color w:val="000000" w:themeColor="text1"/>
-          <w:sz w:val="24"/>
-          <w:szCs w:val="24"/>
-          <w:lang w:eastAsia="it-IT"/>
-        </w:rPr>
-      </w:pPr>
-    </w:p>
-    <w:p>
-      <w:pPr>
-        <w:spacing w:after="240" w:line="330" w:lineRule="atLeast"/>
-        <w:rPr>
-          <w:rFonts w:ascii="Arial" w:eastAsia="Times New Roman" w:hAnsi="Arial" w:cs="Arial"/>
-          <w:i/>
-          <w:iCs/>
-          <w:color w:val="000000" w:themeColor="text1"/>
-          <w:sz w:val="24"/>
-          <w:szCs w:val="24"/>
-          <w:lang w:eastAsia="it-IT"/>
-        </w:rPr>
-      </w:pPr>
-      <w:r>
-        <w:rPr>
-          <w:rFonts w:ascii="Arial" w:eastAsia="Times New Roman" w:hAnsi="Arial" w:cs="Arial"/>
-          <w:i/>
-          <w:iCs/>
-          <w:color w:val="000000" w:themeColor="text1"/>
-          <w:sz w:val="24"/>
-          <w:szCs w:val="24"/>
-          <w:lang w:eastAsia="it-IT"/>
-        </w:rPr>
-        <w:t>OLD</w:t>
-      </w:r>
-    </w:p>
-    <w:p>
-      <w:pPr>
-        <w:spacing w:after="240" w:line="330" w:lineRule="atLeast"/>
-        <w:rPr>
-          <w:rFonts w:ascii="Arial" w:eastAsia="Times New Roman" w:hAnsi="Arial" w:cs="Arial"/>
-          <w:i/>
-          <w:iCs/>
-          <w:color w:val="000000" w:themeColor="text1"/>
-          <w:sz w:val="24"/>
-          <w:szCs w:val="24"/>
-          <w:lang w:eastAsia="it-IT"/>
-        </w:rPr>
-      </w:pPr>
-      <w:proofErr w:type="spellStart"/>
-      <w:r>
-        <w:rPr>
-          <w:rFonts w:ascii="Arial" w:eastAsia="Times New Roman" w:hAnsi="Arial" w:cs="Arial"/>
-          <w:i/>
-          <w:iCs/>
-          <w:color w:val="000000" w:themeColor="text1"/>
-          <w:sz w:val="24"/>
-          <w:szCs w:val="24"/>
-          <w:lang w:eastAsia="it-IT"/>
-        </w:rPr>
-        <w:t>EEPROM.read</w:t>
-      </w:r>
-      <w:proofErr w:type="spellEnd"/>
-      <w:r>
-        <w:rPr>
-          <w:rFonts w:ascii="Arial" w:eastAsia="Times New Roman" w:hAnsi="Arial" w:cs="Arial"/>
-          <w:i/>
-          <w:iCs/>
-          <w:color w:val="000000" w:themeColor="text1"/>
-          <w:sz w:val="24"/>
-          <w:szCs w:val="24"/>
-          <w:lang w:eastAsia="it-IT"/>
-        </w:rPr>
-        <w:t>(5) Indicatore Rete presente (0) Rete assente (1) - NON PIU' UTILIZZATO</w:t>
+          <w:lang w:eastAsia="it-IT"/>
+        </w:rPr>
+        <w:t>EEPROM.read(5) Indicatore Rete presente (0) Rete assente (1) - NON PIU' UTILIZZATO</w:t>
       </w:r>
     </w:p>
     <w:p>
@@ -4025,31 +3815,7 @@
           <w:u w:val="single"/>
           <w:lang w:eastAsia="it-IT"/>
         </w:rPr>
-        <w:t xml:space="preserve">Monitora la tensione di rete tramite un trasformatore e la libreria </w:t>
-      </w:r>
-      <w:proofErr w:type="spellStart"/>
-      <w:r>
-        <w:rPr>
-          <w:rFonts w:ascii="Arial" w:eastAsia="Times New Roman" w:hAnsi="Arial" w:cs="Arial"/>
-          <w:color w:val="000000" w:themeColor="text1"/>
-          <w:sz w:val="24"/>
-          <w:szCs w:val="24"/>
-          <w:u w:val="single"/>
-          <w:lang w:eastAsia="it-IT"/>
-        </w:rPr>
-        <w:t>EmonLib</w:t>
-      </w:r>
-      <w:proofErr w:type="spellEnd"/>
-      <w:r>
-        <w:rPr>
-          <w:rFonts w:ascii="Arial" w:eastAsia="Times New Roman" w:hAnsi="Arial" w:cs="Arial"/>
-          <w:color w:val="000000" w:themeColor="text1"/>
-          <w:sz w:val="24"/>
-          <w:szCs w:val="24"/>
-          <w:u w:val="single"/>
-          <w:lang w:eastAsia="it-IT"/>
-        </w:rPr>
-        <w:t>.</w:t>
+        <w:t>Monitora la tensione di rete tramite un trasformatore e la libreria EmonLib.</w:t>
       </w:r>
     </w:p>
     <w:p>
@@ -4191,7 +3957,6 @@
         </w:rPr>
         <w:t xml:space="preserve">- </w:t>
       </w:r>
-      <w:proofErr w:type="spellStart"/>
       <w:r>
         <w:rPr>
           <w:rFonts w:ascii="Arial" w:eastAsia="Times New Roman" w:hAnsi="Arial" w:cs="Arial"/>
@@ -4204,7 +3969,6 @@
         </w:rPr>
         <w:t>M+numero</w:t>
       </w:r>
-      <w:proofErr w:type="spellEnd"/>
       <w:r>
         <w:rPr>
           <w:rFonts w:ascii="Arial" w:eastAsia="Times New Roman" w:hAnsi="Arial" w:cs="Arial"/>
@@ -5040,29 +4804,7 @@
           <w:szCs w:val="24"/>
           <w:lang w:val="en-US" w:eastAsia="it-IT"/>
         </w:rPr>
-        <w:t xml:space="preserve">→ </w:t>
-      </w:r>
-      <w:proofErr w:type="spellStart"/>
-      <w:r>
-        <w:rPr>
-          <w:rFonts w:ascii="Arial" w:eastAsia="Times New Roman" w:hAnsi="Arial" w:cs="Arial"/>
-          <w:color w:val="000000" w:themeColor="text1"/>
-          <w:sz w:val="24"/>
-          <w:szCs w:val="24"/>
-          <w:lang w:val="en-US" w:eastAsia="it-IT"/>
-        </w:rPr>
-        <w:t>Aggiorna</w:t>
-      </w:r>
-      <w:proofErr w:type="spellEnd"/>
-      <w:r>
-        <w:rPr>
-          <w:rFonts w:ascii="Arial" w:eastAsia="Times New Roman" w:hAnsi="Arial" w:cs="Arial"/>
-          <w:color w:val="000000" w:themeColor="text1"/>
-          <w:sz w:val="24"/>
-          <w:szCs w:val="24"/>
-          <w:lang w:val="en-US" w:eastAsia="it-IT"/>
-        </w:rPr>
-        <w:t xml:space="preserve"> PIN</w:t>
+        <w:t>→ Aggiorna PIN</w:t>
       </w:r>
     </w:p>
     <w:p>
@@ -5206,29 +4948,7 @@
           <w:szCs w:val="24"/>
           <w:lang w:eastAsia="it-IT"/>
         </w:rPr>
-        <w:t xml:space="preserve">- “F12345” </w:t>
-      </w:r>
-      <w:proofErr w:type="spellStart"/>
-      <w:r>
-        <w:rPr>
-          <w:rFonts w:ascii="Arial" w:eastAsia="Times New Roman" w:hAnsi="Arial" w:cs="Arial"/>
-          <w:color w:val="000000" w:themeColor="text1"/>
-          <w:sz w:val="24"/>
-          <w:szCs w:val="24"/>
-          <w:lang w:eastAsia="it-IT"/>
-        </w:rPr>
-        <w:t>Factory</w:t>
-      </w:r>
-      <w:proofErr w:type="spellEnd"/>
-      <w:r>
-        <w:rPr>
-          <w:rFonts w:ascii="Arial" w:eastAsia="Times New Roman" w:hAnsi="Arial" w:cs="Arial"/>
-          <w:color w:val="000000" w:themeColor="text1"/>
-          <w:sz w:val="24"/>
-          <w:szCs w:val="24"/>
-          <w:lang w:eastAsia="it-IT"/>
-        </w:rPr>
-        <w:t xml:space="preserve"> reset - Con PIN - cancella tutti i numeri e ripristina il PIN di fabbrica.</w:t>
+        <w:t>- “F12345” Factory reset - Con PIN - cancella tutti i numeri e ripristina il PIN di fabbrica.</w:t>
       </w:r>
     </w:p>
     <w:p>
@@ -5599,7 +5319,6 @@
                 <w:lang w:eastAsia="it-IT"/>
               </w:rPr>
             </w:pPr>
-            <w:proofErr w:type="spellStart"/>
             <w:r>
               <w:rPr>
                 <w:rFonts w:ascii="Arial" w:eastAsia="Times New Roman" w:hAnsi="Arial" w:cs="Arial"/>
@@ -5610,7 +5329,6 @@
               </w:rPr>
               <w:t>Command</w:t>
             </w:r>
-            <w:proofErr w:type="spellEnd"/>
           </w:p>
         </w:tc>
         <w:tc>
@@ -6152,29 +5870,7 @@
                 <w:szCs w:val="24"/>
                 <w:lang w:val="en-US" w:eastAsia="it-IT"/>
               </w:rPr>
-              <w:t xml:space="preserve">Delete in EEPROM and </w:t>
-            </w:r>
-            <w:proofErr w:type="spellStart"/>
-            <w:r>
-              <w:rPr>
-                <w:rFonts w:ascii="Arial" w:eastAsia="Times New Roman" w:hAnsi="Arial" w:cs="Arial"/>
-                <w:color w:val="000000" w:themeColor="text1"/>
-                <w:sz w:val="24"/>
-                <w:szCs w:val="24"/>
-                <w:lang w:val="en-US" w:eastAsia="it-IT"/>
-              </w:rPr>
-              <w:t>phoneAut</w:t>
-            </w:r>
-            <w:proofErr w:type="spellEnd"/>
-            <w:r>
-              <w:rPr>
-                <w:rFonts w:ascii="Arial" w:eastAsia="Times New Roman" w:hAnsi="Arial" w:cs="Arial"/>
-                <w:color w:val="000000" w:themeColor="text1"/>
-                <w:sz w:val="24"/>
-                <w:szCs w:val="24"/>
-                <w:lang w:val="en-US" w:eastAsia="it-IT"/>
-              </w:rPr>
-              <w:t xml:space="preserve"> auxiliaries phone numbers except the Authorized MASTER[0]</w:t>
+              <w:t>Delete in EEPROM and phoneAut auxiliaries phone numbers except the Authorized MASTER[0]</w:t>
             </w:r>
           </w:p>
           <w:p>
@@ -7065,27 +6761,15 @@
           <w:lang w:eastAsia="it-IT"/>
         </w:rPr>
       </w:pPr>
-      <w:proofErr w:type="spellStart"/>
-      <w:r>
-        <w:rPr>
-          <w:rFonts w:ascii="Arial" w:eastAsia="Times New Roman" w:hAnsi="Arial" w:cs="Arial"/>
-          <w:color w:val="000000" w:themeColor="text1"/>
-          <w:sz w:val="24"/>
-          <w:szCs w:val="24"/>
-          <w:lang w:eastAsia="it-IT"/>
-        </w:rPr>
-        <w:t>EEPROM.read</w:t>
-      </w:r>
-      <w:proofErr w:type="spellEnd"/>
-      <w:r>
-        <w:rPr>
-          <w:rFonts w:ascii="Arial" w:eastAsia="Times New Roman" w:hAnsi="Arial" w:cs="Arial"/>
-          <w:color w:val="000000" w:themeColor="text1"/>
-          <w:sz w:val="24"/>
-          <w:szCs w:val="24"/>
-          <w:lang w:eastAsia="it-IT"/>
-        </w:rPr>
-        <w:t>(5) Indicatore Rete presente (0) Rete assente (1)</w:t>
+      <w:r>
+        <w:rPr>
+          <w:rFonts w:ascii="Arial" w:eastAsia="Times New Roman" w:hAnsi="Arial" w:cs="Arial"/>
+          <w:color w:val="000000" w:themeColor="text1"/>
+          <w:sz w:val="24"/>
+          <w:szCs w:val="24"/>
+          <w:lang w:eastAsia="it-IT"/>
+        </w:rPr>
+        <w:t>EEPROM.read(5) Indicatore Rete presente (0) Rete assente (1)</w:t>
       </w:r>
     </w:p>
     <w:p>
@@ -7377,42 +7061,19 @@
         </w:rPr>
         <w:t>chiama </w:t>
       </w:r>
-      <w:proofErr w:type="spellStart"/>
-      <w:r>
-        <w:fldChar w:fldCharType="begin"/>
-      </w:r>
-      <w:r>
-        <w:instrText>HYPERLINK "vscode-file://vscode-app/c:/Users/Massimo/AppData/Local/Programs/Microsoft%20VS%20Code/f6cfa2ea24/resources/app/out/vs/code/electron-browser/workbench/workbench.html"</w:instrText>
-      </w:r>
-      <w:r>
-        <w:fldChar w:fldCharType="separate"/>
-      </w:r>
-      <w:r>
-        <w:rPr>
-          <w:rFonts w:ascii="Segoe UI" w:eastAsia="Times New Roman" w:hAnsi="Segoe UI" w:cs="Segoe UI"/>
-          <w:color w:val="000000" w:themeColor="text1"/>
-          <w:sz w:val="18"/>
-          <w:szCs w:val="18"/>
-          <w:bdr w:val="single" w:sz="4" w:space="1" w:color="auto" w:frame="1"/>
-          <w:lang w:eastAsia="it-IT"/>
-        </w:rPr>
-        <w:t>initgsm</w:t>
-      </w:r>
-      <w:proofErr w:type="spellEnd"/>
-      <w:r>
-        <w:rPr>
-          <w:rFonts w:ascii="Segoe UI" w:eastAsia="Times New Roman" w:hAnsi="Segoe UI" w:cs="Segoe UI"/>
-          <w:color w:val="000000" w:themeColor="text1"/>
-          <w:sz w:val="18"/>
-          <w:szCs w:val="18"/>
-          <w:bdr w:val="single" w:sz="4" w:space="1" w:color="auto" w:frame="1"/>
-          <w:lang w:eastAsia="it-IT"/>
-        </w:rPr>
-        <w:t>()</w:t>
-      </w:r>
-      <w:r>
-        <w:fldChar w:fldCharType="end"/>
-      </w:r>
+      <w:hyperlink r:id="rId7" w:history="1">
+        <w:r>
+          <w:rPr>
+            <w:rFonts w:ascii="Segoe UI" w:eastAsia="Times New Roman" w:hAnsi="Segoe UI" w:cs="Segoe UI"/>
+            <w:color w:val="000000" w:themeColor="text1"/>
+            <w:sz w:val="18"/>
+            <w:szCs w:val="18"/>
+            <w:bdr w:val="single" w:sz="4" w:space="1" w:color="auto" w:frame="1"/>
+            <w:lang w:eastAsia="it-IT"/>
+          </w:rPr>
+          <w:t>initgsm()</w:t>
+        </w:r>
+      </w:hyperlink>
     </w:p>
     <w:p>
       <w:pPr>
@@ -7439,42 +7100,19 @@
         </w:rPr>
         <w:t>carica numeri autorizzati con </w:t>
       </w:r>
-      <w:proofErr w:type="spellStart"/>
-      <w:r>
-        <w:fldChar w:fldCharType="begin"/>
-      </w:r>
-      <w:r>
-        <w:instrText>HYPERLINK "vscode-file://vscode-app/c:/Users/Massimo/AppData/Local/Programs/Microsoft%20VS%20Code/f6cfa2ea24/resources/app/out/vs/code/electron-browser/workbench/workbench.html"</w:instrText>
-      </w:r>
-      <w:r>
-        <w:fldChar w:fldCharType="separate"/>
-      </w:r>
-      <w:r>
-        <w:rPr>
-          <w:rFonts w:ascii="Segoe UI" w:eastAsia="Times New Roman" w:hAnsi="Segoe UI" w:cs="Segoe UI"/>
-          <w:color w:val="000000" w:themeColor="text1"/>
-          <w:sz w:val="18"/>
-          <w:szCs w:val="18"/>
-          <w:bdr w:val="single" w:sz="4" w:space="1" w:color="auto" w:frame="1"/>
-          <w:lang w:eastAsia="it-IT"/>
-        </w:rPr>
-        <w:t>RestorePhones</w:t>
-      </w:r>
-      <w:proofErr w:type="spellEnd"/>
-      <w:r>
-        <w:rPr>
-          <w:rFonts w:ascii="Segoe UI" w:eastAsia="Times New Roman" w:hAnsi="Segoe UI" w:cs="Segoe UI"/>
-          <w:color w:val="000000" w:themeColor="text1"/>
-          <w:sz w:val="18"/>
-          <w:szCs w:val="18"/>
-          <w:bdr w:val="single" w:sz="4" w:space="1" w:color="auto" w:frame="1"/>
-          <w:lang w:eastAsia="it-IT"/>
-        </w:rPr>
-        <w:t>()</w:t>
-      </w:r>
-      <w:r>
-        <w:fldChar w:fldCharType="end"/>
-      </w:r>
+      <w:hyperlink r:id="rId8" w:history="1">
+        <w:r>
+          <w:rPr>
+            <w:rFonts w:ascii="Segoe UI" w:eastAsia="Times New Roman" w:hAnsi="Segoe UI" w:cs="Segoe UI"/>
+            <w:color w:val="000000" w:themeColor="text1"/>
+            <w:sz w:val="18"/>
+            <w:szCs w:val="18"/>
+            <w:bdr w:val="single" w:sz="4" w:space="1" w:color="auto" w:frame="1"/>
+            <w:lang w:eastAsia="it-IT"/>
+          </w:rPr>
+          <w:t>RestorePhones()</w:t>
+        </w:r>
+      </w:hyperlink>
     </w:p>
     <w:p>
       <w:pPr>
@@ -7491,7 +7129,7 @@
           <w:lang w:eastAsia="it-IT"/>
         </w:rPr>
       </w:pPr>
-      <w:hyperlink r:id="rId7" w:history="1">
+      <w:hyperlink r:id="rId9" w:history="1">
         <w:r>
           <w:rPr>
             <w:rFonts w:ascii="Segoe UI" w:eastAsia="Times New Roman" w:hAnsi="Segoe UI" w:cs="Segoe UI"/>
@@ -7702,7 +7340,6 @@
         </w:rPr>
         <w:t xml:space="preserve"> = </w:t>
       </w:r>
-      <w:proofErr w:type="spellStart"/>
       <w:r>
         <w:rPr>
           <w:rFonts w:ascii="Segoe UI" w:eastAsia="Times New Roman" w:hAnsi="Segoe UI" w:cs="Segoe UI"/>
@@ -7711,18 +7348,7 @@
           <w:szCs w:val="20"/>
           <w:lang w:eastAsia="it-IT"/>
         </w:rPr>
-        <w:t>factory</w:t>
-      </w:r>
-      <w:proofErr w:type="spellEnd"/>
-      <w:r>
-        <w:rPr>
-          <w:rFonts w:ascii="Segoe UI" w:eastAsia="Times New Roman" w:hAnsi="Segoe UI" w:cs="Segoe UI"/>
-          <w:color w:val="000000" w:themeColor="text1"/>
-          <w:sz w:val="20"/>
-          <w:szCs w:val="20"/>
-          <w:lang w:eastAsia="it-IT"/>
-        </w:rPr>
-        <w:t xml:space="preserve"> reset</w:t>
+        <w:t>factory reset</w:t>
       </w:r>
     </w:p>
     <w:p>
@@ -7857,42 +7483,19 @@
         </w:rPr>
         <w:t>ogni 15 minuti verifica reset giornaliero e chiama </w:t>
       </w:r>
-      <w:proofErr w:type="spellStart"/>
-      <w:r>
-        <w:fldChar w:fldCharType="begin"/>
-      </w:r>
-      <w:r>
-        <w:instrText>HYPERLINK "vscode-file://vscode-app/c:/Users/Massimo/AppData/Local/Programs/Microsoft%20VS%20Code/f6cfa2ea24/resources/app/out/vs/code/electron-browser/workbench/workbench.html"</w:instrText>
-      </w:r>
-      <w:r>
-        <w:fldChar w:fldCharType="separate"/>
-      </w:r>
-      <w:r>
-        <w:rPr>
-          <w:rFonts w:ascii="Segoe UI" w:eastAsia="Times New Roman" w:hAnsi="Segoe UI" w:cs="Segoe UI"/>
-          <w:color w:val="000000" w:themeColor="text1"/>
-          <w:sz w:val="18"/>
-          <w:szCs w:val="18"/>
-          <w:bdr w:val="single" w:sz="4" w:space="1" w:color="auto" w:frame="1"/>
-          <w:lang w:eastAsia="it-IT"/>
-        </w:rPr>
-        <w:t>initgsm</w:t>
-      </w:r>
-      <w:proofErr w:type="spellEnd"/>
-      <w:r>
-        <w:rPr>
-          <w:rFonts w:ascii="Segoe UI" w:eastAsia="Times New Roman" w:hAnsi="Segoe UI" w:cs="Segoe UI"/>
-          <w:color w:val="000000" w:themeColor="text1"/>
-          <w:sz w:val="18"/>
-          <w:szCs w:val="18"/>
-          <w:bdr w:val="single" w:sz="4" w:space="1" w:color="auto" w:frame="1"/>
-          <w:lang w:eastAsia="it-IT"/>
-        </w:rPr>
-        <w:t>()</w:t>
-      </w:r>
-      <w:r>
-        <w:fldChar w:fldCharType="end"/>
-      </w:r>
+      <w:hyperlink r:id="rId10" w:history="1">
+        <w:r>
+          <w:rPr>
+            <w:rFonts w:ascii="Segoe UI" w:eastAsia="Times New Roman" w:hAnsi="Segoe UI" w:cs="Segoe UI"/>
+            <w:color w:val="000000" w:themeColor="text1"/>
+            <w:sz w:val="18"/>
+            <w:szCs w:val="18"/>
+            <w:bdr w:val="single" w:sz="4" w:space="1" w:color="auto" w:frame="1"/>
+            <w:lang w:eastAsia="it-IT"/>
+          </w:rPr>
+          <w:t>initgsm()</w:t>
+        </w:r>
+      </w:hyperlink>
       <w:r>
         <w:rPr>
           <w:rFonts w:ascii="Segoe UI" w:eastAsia="Times New Roman" w:hAnsi="Segoe UI" w:cs="Segoe UI"/>
@@ -8043,19 +7646,7 @@
         <w:rPr>
           <w:rFonts w:ascii="Arial" w:hAnsi="Arial" w:cs="Arial"/>
         </w:rPr>
-        <w:t xml:space="preserve">Da </w:t>
-      </w:r>
-      <w:r>
-        <w:rPr>
-          <w:rFonts w:ascii="Arial" w:hAnsi="Arial" w:cs="Arial"/>
-        </w:rPr>
-        <w:t xml:space="preserve">numero </w:t>
-      </w:r>
-      <w:r>
-        <w:rPr>
-          <w:rFonts w:ascii="Arial" w:hAnsi="Arial" w:cs="Arial"/>
-        </w:rPr>
-        <w:t>Master i</w:t>
+        <w:t>Da numero Master i</w:t>
       </w:r>
       <w:r>
         <w:rPr>
@@ -8191,21 +7782,7 @@
         <w:rPr>
           <w:rFonts w:ascii="Arial" w:hAnsi="Arial" w:cs="Arial"/>
         </w:rPr>
-        <w:t xml:space="preserve">Dopo un </w:t>
-      </w:r>
-      <w:proofErr w:type="spellStart"/>
-      <w:r>
-        <w:rPr>
-          <w:rFonts w:ascii="Arial" w:hAnsi="Arial" w:cs="Arial"/>
-        </w:rPr>
-        <w:t>Factory</w:t>
-      </w:r>
-      <w:proofErr w:type="spellEnd"/>
-      <w:r>
-        <w:rPr>
-          <w:rFonts w:ascii="Arial" w:hAnsi="Arial" w:cs="Arial"/>
-        </w:rPr>
-        <w:t xml:space="preserve"> Reset (c</w:t>
+        <w:t>Dopo un Factory Reset (c</w:t>
       </w:r>
       <w:r>
         <w:rPr>
@@ -8957,7 +8534,7 @@
           <w:color w:val="000000" w:themeColor="text1"/>
           <w:sz w:val="24"/>
           <w:szCs w:val="24"/>
-          <w:lang w:eastAsia="it-IT"/>
+          <w:lang w:val="en-US" w:eastAsia="it-IT"/>
         </w:rPr>
       </w:pPr>
       <w:r>
@@ -8980,50 +8557,10 @@
           <w:color w:val="000000" w:themeColor="text1"/>
           <w:sz w:val="24"/>
           <w:szCs w:val="24"/>
-          <w:lang w:eastAsia="it-IT"/>
-        </w:rPr>
-        <w:t xml:space="preserve">P </w:t>
-      </w:r>
-      <w:proofErr w:type="spellStart"/>
-      <w:r>
-        <w:rPr>
-          <w:rFonts w:ascii="Arial" w:eastAsia="Times New Roman" w:hAnsi="Arial" w:cs="Arial"/>
-          <w:i/>
-          <w:iCs/>
-          <w:color w:val="000000" w:themeColor="text1"/>
-          <w:sz w:val="24"/>
-          <w:szCs w:val="24"/>
-          <w:lang w:eastAsia="it-IT"/>
-        </w:rPr>
-        <w:t>OldPIN</w:t>
-      </w:r>
-      <w:proofErr w:type="spellEnd"/>
-      <w:r>
-        <w:rPr>
-          <w:rFonts w:ascii="Arial" w:eastAsia="Times New Roman" w:hAnsi="Arial" w:cs="Arial"/>
-          <w:i/>
-          <w:iCs/>
-          <w:color w:val="000000" w:themeColor="text1"/>
-          <w:sz w:val="24"/>
-          <w:szCs w:val="24"/>
-          <w:lang w:eastAsia="it-IT"/>
-        </w:rPr>
-        <w:t xml:space="preserve"> </w:t>
-      </w:r>
-      <w:proofErr w:type="spellStart"/>
-      <w:r>
-        <w:rPr>
-          <w:rFonts w:ascii="Arial" w:eastAsia="Times New Roman" w:hAnsi="Arial" w:cs="Arial"/>
-          <w:i/>
-          <w:iCs/>
-          <w:color w:val="000000" w:themeColor="text1"/>
-          <w:sz w:val="24"/>
-          <w:szCs w:val="24"/>
-          <w:lang w:eastAsia="it-IT"/>
-        </w:rPr>
-        <w:t>NewPIN</w:t>
-      </w:r>
-      <w:proofErr w:type="spellEnd"/>
+          <w:lang w:val="en-US" w:eastAsia="it-IT"/>
+        </w:rPr>
+        <w:t>P OldPIN NewPIN</w:t>
+      </w:r>
     </w:p>
     <w:p>
       <w:pPr>
@@ -9034,7 +8571,7 @@
           <w:bCs/>
           <w:sz w:val="24"/>
           <w:szCs w:val="24"/>
-          <w:lang w:eastAsia="it-IT"/>
+          <w:lang w:val="en-US" w:eastAsia="it-IT"/>
         </w:rPr>
       </w:pPr>
     </w:p>
@@ -9047,7 +8584,7 @@
           <w:bCs/>
           <w:sz w:val="24"/>
           <w:szCs w:val="24"/>
-          <w:lang w:eastAsia="it-IT"/>
+          <w:lang w:val="en-US" w:eastAsia="it-IT"/>
         </w:rPr>
       </w:pPr>
       <w:r>
@@ -9057,55 +8594,9 @@
           <w:bCs/>
           <w:sz w:val="24"/>
           <w:szCs w:val="24"/>
-          <w:lang w:eastAsia="it-IT"/>
-        </w:rPr>
-        <w:t xml:space="preserve">Comando </w:t>
-      </w:r>
-      <w:r>
-        <w:rPr>
-          <w:rFonts w:ascii="Arial" w:eastAsia="Times New Roman" w:hAnsi="Arial" w:cs="Arial"/>
-          <w:b/>
-          <w:bCs/>
-          <w:sz w:val="24"/>
-          <w:szCs w:val="24"/>
-          <w:lang w:eastAsia="it-IT"/>
-        </w:rPr>
-        <w:t>F</w:t>
-      </w:r>
-      <w:r>
-        <w:rPr>
-          <w:rFonts w:ascii="Arial" w:eastAsia="Times New Roman" w:hAnsi="Arial" w:cs="Arial"/>
-          <w:b/>
-          <w:bCs/>
-          <w:sz w:val="24"/>
-          <w:szCs w:val="24"/>
-          <w:lang w:eastAsia="it-IT"/>
-        </w:rPr>
-        <w:t xml:space="preserve"> – </w:t>
-      </w:r>
-      <w:proofErr w:type="spellStart"/>
-      <w:r>
-        <w:rPr>
-          <w:rFonts w:ascii="Arial" w:eastAsia="Times New Roman" w:hAnsi="Arial" w:cs="Arial"/>
-          <w:b/>
-          <w:bCs/>
-          <w:sz w:val="24"/>
-          <w:szCs w:val="24"/>
-          <w:lang w:eastAsia="it-IT"/>
-        </w:rPr>
-        <w:t>Factory</w:t>
-      </w:r>
-      <w:proofErr w:type="spellEnd"/>
-      <w:r>
-        <w:rPr>
-          <w:rFonts w:ascii="Arial" w:eastAsia="Times New Roman" w:hAnsi="Arial" w:cs="Arial"/>
-          <w:b/>
-          <w:bCs/>
-          <w:sz w:val="24"/>
-          <w:szCs w:val="24"/>
-          <w:lang w:eastAsia="it-IT"/>
-        </w:rPr>
-        <w:t xml:space="preserve"> Reset</w:t>
+          <w:lang w:val="en-US" w:eastAsia="it-IT"/>
+        </w:rPr>
+        <w:t>Comando F – Factory Reset</w:t>
       </w:r>
     </w:p>
     <w:p>
@@ -9126,13 +8617,7 @@
         <w:rPr>
           <w:rFonts w:ascii="Arial" w:hAnsi="Arial" w:cs="Arial"/>
         </w:rPr>
-        <w:t xml:space="preserve">, </w:t>
-      </w:r>
-      <w:r>
-        <w:rPr>
-          <w:rFonts w:ascii="Arial" w:hAnsi="Arial" w:cs="Arial"/>
-        </w:rPr>
-        <w:t>c</w:t>
+        <w:t>, c</w:t>
       </w:r>
       <w:r>
         <w:rPr>
@@ -9595,16 +9080,7 @@
                 <w:szCs w:val="16"/>
                 <w:lang w:val="en-US" w:eastAsia="it-IT"/>
               </w:rPr>
-              <w:t>1.</w:t>
-            </w:r>
-            <w:r>
-              <w:rPr>
-                <w:rFonts w:ascii="Arial" w:eastAsia="Times New Roman" w:hAnsi="Arial" w:cs="Arial"/>
-                <w:sz w:val="16"/>
-                <w:szCs w:val="16"/>
-                <w:lang w:val="en-US" w:eastAsia="it-IT"/>
-              </w:rPr>
-              <w:t>2</w:t>
+              <w:t>0.1</w:t>
             </w:r>
           </w:p>
         </w:tc>
@@ -9632,7 +9108,7 @@
                 <w:szCs w:val="16"/>
                 <w:lang w:eastAsia="it-IT"/>
               </w:rPr>
-              <w:t>Primi LAB TESTS</w:t>
+              <w:t>Impostazioni preliminari. Solo Dev</w:t>
             </w:r>
           </w:p>
         </w:tc>
@@ -9914,7 +9390,7 @@
                 <w:szCs w:val="16"/>
                 <w:lang w:eastAsia="it-IT"/>
               </w:rPr>
-              <w:t>Primi LAB TESTS</w:t>
+              <w:t>Impostazioni preliminari. Solo Dev</w:t>
             </w:r>
           </w:p>
         </w:tc>
@@ -9935,25 +9411,14 @@
                 <w:lang w:eastAsia="it-IT"/>
               </w:rPr>
             </w:pPr>
-            <w:proofErr w:type="spellStart"/>
-            <w:r>
-              <w:rPr>
-                <w:rFonts w:ascii="Arial" w:eastAsia="Times New Roman" w:hAnsi="Arial" w:cs="Arial"/>
-                <w:sz w:val="16"/>
-                <w:szCs w:val="16"/>
-                <w:lang w:eastAsia="it-IT"/>
-              </w:rPr>
-              <w:t>Factory</w:t>
-            </w:r>
-            <w:proofErr w:type="spellEnd"/>
-            <w:r>
-              <w:rPr>
-                <w:rFonts w:ascii="Arial" w:eastAsia="Times New Roman" w:hAnsi="Arial" w:cs="Arial"/>
-                <w:sz w:val="16"/>
-                <w:szCs w:val="16"/>
-                <w:lang w:eastAsia="it-IT"/>
-              </w:rPr>
-              <w:t xml:space="preserve"> Reset</w:t>
+            <w:r>
+              <w:rPr>
+                <w:rFonts w:ascii="Arial" w:eastAsia="Times New Roman" w:hAnsi="Arial" w:cs="Arial"/>
+                <w:sz w:val="16"/>
+                <w:szCs w:val="16"/>
+                <w:lang w:eastAsia="it-IT"/>
+              </w:rPr>
+              <w:t>Factory Reset</w:t>
             </w:r>
           </w:p>
         </w:tc>
@@ -10214,27 +9679,7 @@
                 <w:szCs w:val="16"/>
                 <w:lang w:eastAsia="it-IT"/>
               </w:rPr>
-              <w:t xml:space="preserve"> (da </w:t>
-            </w:r>
-            <w:proofErr w:type="spellStart"/>
-            <w:r>
-              <w:rPr>
-                <w:rFonts w:ascii="Arial" w:eastAsia="Times New Roman" w:hAnsi="Arial" w:cs="Arial"/>
-                <w:sz w:val="16"/>
-                <w:szCs w:val="16"/>
-                <w:lang w:eastAsia="it-IT"/>
-              </w:rPr>
-              <w:t>Factory</w:t>
-            </w:r>
-            <w:proofErr w:type="spellEnd"/>
-            <w:r>
-              <w:rPr>
-                <w:rFonts w:ascii="Arial" w:eastAsia="Times New Roman" w:hAnsi="Arial" w:cs="Arial"/>
-                <w:sz w:val="16"/>
-                <w:szCs w:val="16"/>
-                <w:lang w:eastAsia="it-IT"/>
-              </w:rPr>
-              <w:t xml:space="preserve"> Reset)</w:t>
+              <w:t xml:space="preserve"> (da Factory Reset)</w:t>
             </w:r>
           </w:p>
         </w:tc>
@@ -10255,25 +9700,14 @@
                 <w:lang w:eastAsia="it-IT"/>
               </w:rPr>
             </w:pPr>
-            <w:proofErr w:type="spellStart"/>
-            <w:r>
-              <w:rPr>
-                <w:rFonts w:ascii="Arial" w:eastAsia="Times New Roman" w:hAnsi="Arial" w:cs="Arial"/>
-                <w:sz w:val="16"/>
-                <w:szCs w:val="16"/>
-                <w:lang w:eastAsia="it-IT"/>
-              </w:rPr>
-              <w:t>Factory</w:t>
-            </w:r>
-            <w:proofErr w:type="spellEnd"/>
-            <w:r>
-              <w:rPr>
-                <w:rFonts w:ascii="Arial" w:eastAsia="Times New Roman" w:hAnsi="Arial" w:cs="Arial"/>
-                <w:sz w:val="16"/>
-                <w:szCs w:val="16"/>
-                <w:lang w:eastAsia="it-IT"/>
-              </w:rPr>
-              <w:t xml:space="preserve"> Reset</w:t>
+            <w:r>
+              <w:rPr>
+                <w:rFonts w:ascii="Arial" w:eastAsia="Times New Roman" w:hAnsi="Arial" w:cs="Arial"/>
+                <w:sz w:val="16"/>
+                <w:szCs w:val="16"/>
+                <w:lang w:eastAsia="it-IT"/>
+              </w:rPr>
+              <w:t>Factory Reset</w:t>
             </w:r>
           </w:p>
         </w:tc>
@@ -10835,45 +10269,14 @@
                 <w:lang w:eastAsia="it-IT"/>
               </w:rPr>
             </w:pPr>
-            <w:proofErr w:type="spellStart"/>
-            <w:r>
-              <w:rPr>
-                <w:rFonts w:ascii="Arial" w:eastAsia="Times New Roman" w:hAnsi="Arial" w:cs="Arial"/>
-                <w:sz w:val="16"/>
-                <w:szCs w:val="16"/>
-                <w:lang w:eastAsia="it-IT"/>
-              </w:rPr>
-              <w:t>n.telefonico</w:t>
-            </w:r>
-            <w:proofErr w:type="spellEnd"/>
-            <w:r>
-              <w:rPr>
-                <w:rFonts w:ascii="Arial" w:eastAsia="Times New Roman" w:hAnsi="Arial" w:cs="Arial"/>
-                <w:sz w:val="16"/>
-                <w:szCs w:val="16"/>
-                <w:lang w:eastAsia="it-IT"/>
-              </w:rPr>
-              <w:t xml:space="preserve"> MASTER </w:t>
-            </w:r>
-            <w:proofErr w:type="spellStart"/>
-            <w:r>
-              <w:rPr>
-                <w:rFonts w:ascii="Arial" w:eastAsia="Times New Roman" w:hAnsi="Arial" w:cs="Arial"/>
-                <w:sz w:val="16"/>
-                <w:szCs w:val="16"/>
-                <w:lang w:eastAsia="it-IT"/>
-              </w:rPr>
-              <w:t>gìà</w:t>
-            </w:r>
-            <w:proofErr w:type="spellEnd"/>
-            <w:r>
-              <w:rPr>
-                <w:rFonts w:ascii="Arial" w:eastAsia="Times New Roman" w:hAnsi="Arial" w:cs="Arial"/>
-                <w:sz w:val="16"/>
-                <w:szCs w:val="16"/>
-                <w:lang w:eastAsia="it-IT"/>
-              </w:rPr>
-              <w:t xml:space="preserve"> definito</w:t>
+            <w:r>
+              <w:rPr>
+                <w:rFonts w:ascii="Arial" w:eastAsia="Times New Roman" w:hAnsi="Arial" w:cs="Arial"/>
+                <w:sz w:val="16"/>
+                <w:szCs w:val="16"/>
+                <w:lang w:eastAsia="it-IT"/>
+              </w:rPr>
+              <w:t>n.telefonico MASTER gìà definito</w:t>
             </w:r>
           </w:p>
         </w:tc>
@@ -13726,25 +13129,14 @@
                 <w:lang w:eastAsia="it-IT"/>
               </w:rPr>
             </w:pPr>
-            <w:proofErr w:type="spellStart"/>
-            <w:r>
-              <w:rPr>
-                <w:rFonts w:ascii="Arial" w:eastAsia="Times New Roman" w:hAnsi="Arial" w:cs="Arial"/>
-                <w:sz w:val="16"/>
-                <w:szCs w:val="16"/>
-                <w:lang w:eastAsia="it-IT"/>
-              </w:rPr>
-              <w:t>Operation</w:t>
-            </w:r>
-            <w:proofErr w:type="spellEnd"/>
-            <w:r>
-              <w:rPr>
-                <w:rFonts w:ascii="Arial" w:eastAsia="Times New Roman" w:hAnsi="Arial" w:cs="Arial"/>
-                <w:sz w:val="16"/>
-                <w:szCs w:val="16"/>
-                <w:lang w:eastAsia="it-IT"/>
-              </w:rPr>
-              <w:t xml:space="preserve"> SET</w:t>
+            <w:r>
+              <w:rPr>
+                <w:rFonts w:ascii="Arial" w:eastAsia="Times New Roman" w:hAnsi="Arial" w:cs="Arial"/>
+                <w:sz w:val="16"/>
+                <w:szCs w:val="16"/>
+                <w:lang w:eastAsia="it-IT"/>
+              </w:rPr>
+              <w:t>Operation SET</w:t>
             </w:r>
           </w:p>
         </w:tc>
@@ -14018,25 +13410,14 @@
                 <w:lang w:eastAsia="it-IT"/>
               </w:rPr>
             </w:pPr>
-            <w:proofErr w:type="spellStart"/>
-            <w:r>
-              <w:rPr>
-                <w:rFonts w:ascii="Arial" w:eastAsia="Times New Roman" w:hAnsi="Arial" w:cs="Arial"/>
-                <w:sz w:val="16"/>
-                <w:szCs w:val="16"/>
-                <w:lang w:eastAsia="it-IT"/>
-              </w:rPr>
-              <w:t>Operation</w:t>
-            </w:r>
-            <w:proofErr w:type="spellEnd"/>
-            <w:r>
-              <w:rPr>
-                <w:rFonts w:ascii="Arial" w:eastAsia="Times New Roman" w:hAnsi="Arial" w:cs="Arial"/>
-                <w:sz w:val="16"/>
-                <w:szCs w:val="16"/>
-                <w:lang w:eastAsia="it-IT"/>
-              </w:rPr>
-              <w:t xml:space="preserve"> SET</w:t>
+            <w:r>
+              <w:rPr>
+                <w:rFonts w:ascii="Arial" w:eastAsia="Times New Roman" w:hAnsi="Arial" w:cs="Arial"/>
+                <w:sz w:val="16"/>
+                <w:szCs w:val="16"/>
+                <w:lang w:eastAsia="it-IT"/>
+              </w:rPr>
+              <w:t>Operation SET</w:t>
             </w:r>
           </w:p>
         </w:tc>
@@ -14152,27 +13533,7 @@
                 <w:szCs w:val="16"/>
                 <w:lang w:val="en-US" w:eastAsia="it-IT"/>
               </w:rPr>
-              <w:t xml:space="preserve">SMS a </w:t>
-            </w:r>
-            <w:proofErr w:type="spellStart"/>
-            <w:r>
-              <w:rPr>
-                <w:rFonts w:ascii="Arial" w:eastAsia="Times New Roman" w:hAnsi="Arial" w:cs="Arial"/>
-                <w:sz w:val="16"/>
-                <w:szCs w:val="16"/>
-                <w:lang w:val="en-US" w:eastAsia="it-IT"/>
-              </w:rPr>
-              <w:t>Richiedente</w:t>
-            </w:r>
-            <w:proofErr w:type="spellEnd"/>
-            <w:r>
-              <w:rPr>
-                <w:rFonts w:ascii="Arial" w:eastAsia="Times New Roman" w:hAnsi="Arial" w:cs="Arial"/>
-                <w:sz w:val="16"/>
-                <w:szCs w:val="16"/>
-                <w:lang w:val="en-US" w:eastAsia="it-IT"/>
-              </w:rPr>
-              <w:t xml:space="preserve">; </w:t>
+              <w:t xml:space="preserve">SMS a Richiedente; </w:t>
             </w:r>
             <w:r>
               <w:rPr>
@@ -14266,25 +13627,14 @@
                 <w:lang w:eastAsia="it-IT"/>
               </w:rPr>
             </w:pPr>
-            <w:proofErr w:type="spellStart"/>
-            <w:r>
-              <w:rPr>
-                <w:rFonts w:ascii="Arial" w:eastAsia="Times New Roman" w:hAnsi="Arial" w:cs="Arial"/>
-                <w:sz w:val="16"/>
-                <w:szCs w:val="16"/>
-                <w:lang w:eastAsia="it-IT"/>
-              </w:rPr>
-              <w:t>Operation</w:t>
-            </w:r>
-            <w:proofErr w:type="spellEnd"/>
-            <w:r>
-              <w:rPr>
-                <w:rFonts w:ascii="Arial" w:eastAsia="Times New Roman" w:hAnsi="Arial" w:cs="Arial"/>
-                <w:sz w:val="16"/>
-                <w:szCs w:val="16"/>
-                <w:lang w:eastAsia="it-IT"/>
-              </w:rPr>
-              <w:t xml:space="preserve"> SET</w:t>
+            <w:r>
+              <w:rPr>
+                <w:rFonts w:ascii="Arial" w:eastAsia="Times New Roman" w:hAnsi="Arial" w:cs="Arial"/>
+                <w:sz w:val="16"/>
+                <w:szCs w:val="16"/>
+                <w:lang w:eastAsia="it-IT"/>
+              </w:rPr>
+              <w:t>Operation SET</w:t>
             </w:r>
           </w:p>
         </w:tc>
@@ -14312,19 +13662,8 @@
                 <w:szCs w:val="16"/>
                 <w:lang w:eastAsia="it-IT"/>
               </w:rPr>
-              <w:t xml:space="preserve">Ritorna il valore di Tensione + </w:t>
-            </w:r>
-            <w:proofErr w:type="spellStart"/>
-            <w:r>
-              <w:rPr>
-                <w:rFonts w:ascii="Arial" w:eastAsia="Times New Roman" w:hAnsi="Arial" w:cs="Arial"/>
-                <w:sz w:val="16"/>
-                <w:szCs w:val="16"/>
-                <w:lang w:eastAsia="it-IT"/>
-              </w:rPr>
-              <w:t>Timestamp</w:t>
-            </w:r>
-            <w:proofErr w:type="spellEnd"/>
+              <w:t>Ritorna il valore di Tensione + Timestamp</w:t>
+            </w:r>
           </w:p>
         </w:tc>
         <w:tc>
@@ -14424,7 +13763,6 @@
                 <w:lang w:eastAsia="it-IT"/>
               </w:rPr>
             </w:pPr>
-            <w:proofErr w:type="spellStart"/>
             <w:r>
               <w:rPr>
                 <w:rFonts w:ascii="Arial" w:eastAsia="Times New Roman" w:hAnsi="Arial" w:cs="Arial"/>
@@ -14436,7 +13774,6 @@
               </w:rPr>
               <w:t>timestamp</w:t>
             </w:r>
-            <w:proofErr w:type="spellEnd"/>
             <w:r>
               <w:rPr>
                 <w:rFonts w:ascii="Arial" w:eastAsia="Times New Roman" w:hAnsi="Arial" w:cs="Arial"/>
@@ -14446,7 +13783,6 @@
               </w:rPr>
               <w:t xml:space="preserve"> “Current Voltage: “</w:t>
             </w:r>
-            <w:proofErr w:type="spellStart"/>
             <w:r>
               <w:rPr>
                 <w:rFonts w:ascii="Arial" w:eastAsia="Times New Roman" w:hAnsi="Arial" w:cs="Arial"/>
@@ -14458,35 +13794,14 @@
               </w:rPr>
               <w:t>voltage</w:t>
             </w:r>
-            <w:proofErr w:type="spellEnd"/>
-            <w:r>
-              <w:rPr>
-                <w:rFonts w:ascii="Arial" w:eastAsia="Times New Roman" w:hAnsi="Arial" w:cs="Arial"/>
-                <w:sz w:val="16"/>
-                <w:szCs w:val="16"/>
-                <w:lang w:eastAsia="it-IT"/>
-              </w:rPr>
-              <w:t xml:space="preserve"> “</w:t>
-            </w:r>
-            <w:proofErr w:type="spellStart"/>
-            <w:r>
-              <w:rPr>
-                <w:rFonts w:ascii="Arial" w:eastAsia="Times New Roman" w:hAnsi="Arial" w:cs="Arial"/>
-                <w:sz w:val="16"/>
-                <w:szCs w:val="16"/>
-                <w:lang w:eastAsia="it-IT"/>
-              </w:rPr>
-              <w:t>Vac</w:t>
-            </w:r>
-            <w:proofErr w:type="spellEnd"/>
-            <w:r>
-              <w:rPr>
-                <w:rFonts w:ascii="Arial" w:eastAsia="Times New Roman" w:hAnsi="Arial" w:cs="Arial"/>
-                <w:sz w:val="16"/>
-                <w:szCs w:val="16"/>
-                <w:lang w:eastAsia="it-IT"/>
-              </w:rPr>
-              <w:t>"</w:t>
+            <w:r>
+              <w:rPr>
+                <w:rFonts w:ascii="Arial" w:eastAsia="Times New Roman" w:hAnsi="Arial" w:cs="Arial"/>
+                <w:sz w:val="16"/>
+                <w:szCs w:val="16"/>
+                <w:lang w:eastAsia="it-IT"/>
+              </w:rPr>
+              <w:t xml:space="preserve"> “Vac"</w:t>
             </w:r>
           </w:p>
         </w:tc>
@@ -14559,25 +13874,14 @@
                 <w:lang w:eastAsia="it-IT"/>
               </w:rPr>
             </w:pPr>
-            <w:proofErr w:type="spellStart"/>
-            <w:r>
-              <w:rPr>
-                <w:rFonts w:ascii="Arial" w:eastAsia="Times New Roman" w:hAnsi="Arial" w:cs="Arial"/>
-                <w:sz w:val="16"/>
-                <w:szCs w:val="16"/>
-                <w:lang w:eastAsia="it-IT"/>
-              </w:rPr>
-              <w:t>Operation</w:t>
-            </w:r>
-            <w:proofErr w:type="spellEnd"/>
-            <w:r>
-              <w:rPr>
-                <w:rFonts w:ascii="Arial" w:eastAsia="Times New Roman" w:hAnsi="Arial" w:cs="Arial"/>
-                <w:sz w:val="16"/>
-                <w:szCs w:val="16"/>
-                <w:lang w:eastAsia="it-IT"/>
-              </w:rPr>
-              <w:t xml:space="preserve"> SET</w:t>
+            <w:r>
+              <w:rPr>
+                <w:rFonts w:ascii="Arial" w:eastAsia="Times New Roman" w:hAnsi="Arial" w:cs="Arial"/>
+                <w:sz w:val="16"/>
+                <w:szCs w:val="16"/>
+                <w:lang w:eastAsia="it-IT"/>
+              </w:rPr>
+              <w:t>Operation SET</w:t>
             </w:r>
           </w:p>
         </w:tc>
@@ -14605,19 +13909,8 @@
                 <w:szCs w:val="16"/>
                 <w:lang w:eastAsia="it-IT"/>
               </w:rPr>
-              <w:t xml:space="preserve">Ritorna il valore di Tensione + </w:t>
-            </w:r>
-            <w:proofErr w:type="spellStart"/>
-            <w:r>
-              <w:rPr>
-                <w:rFonts w:ascii="Arial" w:eastAsia="Times New Roman" w:hAnsi="Arial" w:cs="Arial"/>
-                <w:sz w:val="16"/>
-                <w:szCs w:val="16"/>
-                <w:lang w:eastAsia="it-IT"/>
-              </w:rPr>
-              <w:t>Timestamp</w:t>
-            </w:r>
-            <w:proofErr w:type="spellEnd"/>
+              <w:t>Ritorna il valore di Tensione + Timestamp</w:t>
+            </w:r>
           </w:p>
         </w:tc>
         <w:tc>
@@ -14717,7 +14010,6 @@
                 <w:lang w:eastAsia="it-IT"/>
               </w:rPr>
             </w:pPr>
-            <w:proofErr w:type="spellStart"/>
             <w:r>
               <w:rPr>
                 <w:rFonts w:ascii="Arial" w:eastAsia="Times New Roman" w:hAnsi="Arial" w:cs="Arial"/>
@@ -14729,7 +14021,6 @@
               </w:rPr>
               <w:t>timestamp</w:t>
             </w:r>
-            <w:proofErr w:type="spellEnd"/>
             <w:r>
               <w:rPr>
                 <w:rFonts w:ascii="Arial" w:eastAsia="Times New Roman" w:hAnsi="Arial" w:cs="Arial"/>
@@ -14739,7 +14030,6 @@
               </w:rPr>
               <w:t xml:space="preserve"> “Current Voltage: “</w:t>
             </w:r>
-            <w:proofErr w:type="spellStart"/>
             <w:r>
               <w:rPr>
                 <w:rFonts w:ascii="Arial" w:eastAsia="Times New Roman" w:hAnsi="Arial" w:cs="Arial"/>
@@ -14751,35 +14041,14 @@
               </w:rPr>
               <w:t>voltage</w:t>
             </w:r>
-            <w:proofErr w:type="spellEnd"/>
-            <w:r>
-              <w:rPr>
-                <w:rFonts w:ascii="Arial" w:eastAsia="Times New Roman" w:hAnsi="Arial" w:cs="Arial"/>
-                <w:sz w:val="16"/>
-                <w:szCs w:val="16"/>
-                <w:lang w:eastAsia="it-IT"/>
-              </w:rPr>
-              <w:t xml:space="preserve"> “</w:t>
-            </w:r>
-            <w:proofErr w:type="spellStart"/>
-            <w:r>
-              <w:rPr>
-                <w:rFonts w:ascii="Arial" w:eastAsia="Times New Roman" w:hAnsi="Arial" w:cs="Arial"/>
-                <w:sz w:val="16"/>
-                <w:szCs w:val="16"/>
-                <w:lang w:eastAsia="it-IT"/>
-              </w:rPr>
-              <w:t>Vac</w:t>
-            </w:r>
-            <w:proofErr w:type="spellEnd"/>
-            <w:r>
-              <w:rPr>
-                <w:rFonts w:ascii="Arial" w:eastAsia="Times New Roman" w:hAnsi="Arial" w:cs="Arial"/>
-                <w:sz w:val="16"/>
-                <w:szCs w:val="16"/>
-                <w:lang w:eastAsia="it-IT"/>
-              </w:rPr>
-              <w:t>"</w:t>
+            <w:r>
+              <w:rPr>
+                <w:rFonts w:ascii="Arial" w:eastAsia="Times New Roman" w:hAnsi="Arial" w:cs="Arial"/>
+                <w:sz w:val="16"/>
+                <w:szCs w:val="16"/>
+                <w:lang w:eastAsia="it-IT"/>
+              </w:rPr>
+              <w:t xml:space="preserve"> “Vac"</w:t>
             </w:r>
           </w:p>
         </w:tc>
@@ -14852,25 +14121,14 @@
                 <w:lang w:eastAsia="it-IT"/>
               </w:rPr>
             </w:pPr>
-            <w:proofErr w:type="spellStart"/>
-            <w:r>
-              <w:rPr>
-                <w:rFonts w:ascii="Arial" w:eastAsia="Times New Roman" w:hAnsi="Arial" w:cs="Arial"/>
-                <w:sz w:val="16"/>
-                <w:szCs w:val="16"/>
-                <w:lang w:eastAsia="it-IT"/>
-              </w:rPr>
-              <w:t>Operation</w:t>
-            </w:r>
-            <w:proofErr w:type="spellEnd"/>
-            <w:r>
-              <w:rPr>
-                <w:rFonts w:ascii="Arial" w:eastAsia="Times New Roman" w:hAnsi="Arial" w:cs="Arial"/>
-                <w:sz w:val="16"/>
-                <w:szCs w:val="16"/>
-                <w:lang w:eastAsia="it-IT"/>
-              </w:rPr>
-              <w:t xml:space="preserve"> SET</w:t>
+            <w:r>
+              <w:rPr>
+                <w:rFonts w:ascii="Arial" w:eastAsia="Times New Roman" w:hAnsi="Arial" w:cs="Arial"/>
+                <w:sz w:val="16"/>
+                <w:szCs w:val="16"/>
+                <w:lang w:eastAsia="it-IT"/>
+              </w:rPr>
+              <w:t>Operation SET</w:t>
             </w:r>
           </w:p>
         </w:tc>
@@ -14898,19 +14156,8 @@
                 <w:szCs w:val="16"/>
                 <w:lang w:eastAsia="it-IT"/>
               </w:rPr>
-              <w:t xml:space="preserve">Ritorna il valore di Tensione + </w:t>
-            </w:r>
-            <w:proofErr w:type="spellStart"/>
-            <w:r>
-              <w:rPr>
-                <w:rFonts w:ascii="Arial" w:eastAsia="Times New Roman" w:hAnsi="Arial" w:cs="Arial"/>
-                <w:sz w:val="16"/>
-                <w:szCs w:val="16"/>
-                <w:lang w:eastAsia="it-IT"/>
-              </w:rPr>
-              <w:t>Timestamp</w:t>
-            </w:r>
-            <w:proofErr w:type="spellEnd"/>
+              <w:t>Ritorna il valore di Tensione + Timestamp</w:t>
+            </w:r>
           </w:p>
         </w:tc>
         <w:tc>
@@ -15102,25 +14349,14 @@
                 <w:lang w:val="en-US" w:eastAsia="it-IT"/>
               </w:rPr>
             </w:pPr>
-            <w:proofErr w:type="spellStart"/>
-            <w:r>
-              <w:rPr>
-                <w:rFonts w:ascii="Arial" w:eastAsia="Times New Roman" w:hAnsi="Arial" w:cs="Arial"/>
-                <w:sz w:val="16"/>
-                <w:szCs w:val="16"/>
-                <w:lang w:eastAsia="it-IT"/>
-              </w:rPr>
-              <w:t>Operation</w:t>
-            </w:r>
-            <w:proofErr w:type="spellEnd"/>
-            <w:r>
-              <w:rPr>
-                <w:rFonts w:ascii="Arial" w:eastAsia="Times New Roman" w:hAnsi="Arial" w:cs="Arial"/>
-                <w:sz w:val="16"/>
-                <w:szCs w:val="16"/>
-                <w:lang w:eastAsia="it-IT"/>
-              </w:rPr>
-              <w:t xml:space="preserve"> SET</w:t>
+            <w:r>
+              <w:rPr>
+                <w:rFonts w:ascii="Arial" w:eastAsia="Times New Roman" w:hAnsi="Arial" w:cs="Arial"/>
+                <w:sz w:val="16"/>
+                <w:szCs w:val="16"/>
+                <w:lang w:eastAsia="it-IT"/>
+              </w:rPr>
+              <w:t>Operation SET</w:t>
             </w:r>
           </w:p>
         </w:tc>
@@ -15335,25 +14571,14 @@
                 <w:lang w:eastAsia="it-IT"/>
               </w:rPr>
             </w:pPr>
-            <w:proofErr w:type="spellStart"/>
-            <w:r>
-              <w:rPr>
-                <w:rFonts w:ascii="Arial" w:eastAsia="Times New Roman" w:hAnsi="Arial" w:cs="Arial"/>
-                <w:sz w:val="16"/>
-                <w:szCs w:val="16"/>
-                <w:lang w:eastAsia="it-IT"/>
-              </w:rPr>
-              <w:t>Operation</w:t>
-            </w:r>
-            <w:proofErr w:type="spellEnd"/>
-            <w:r>
-              <w:rPr>
-                <w:rFonts w:ascii="Arial" w:eastAsia="Times New Roman" w:hAnsi="Arial" w:cs="Arial"/>
-                <w:sz w:val="16"/>
-                <w:szCs w:val="16"/>
-                <w:lang w:eastAsia="it-IT"/>
-              </w:rPr>
-              <w:t xml:space="preserve"> SET</w:t>
+            <w:r>
+              <w:rPr>
+                <w:rFonts w:ascii="Arial" w:eastAsia="Times New Roman" w:hAnsi="Arial" w:cs="Arial"/>
+                <w:sz w:val="16"/>
+                <w:szCs w:val="16"/>
+                <w:lang w:eastAsia="it-IT"/>
+              </w:rPr>
+              <w:t>Operation SET</w:t>
             </w:r>
           </w:p>
         </w:tc>
@@ -15487,27 +14712,7 @@
                 <w:szCs w:val="16"/>
                 <w:lang w:val="en-US" w:eastAsia="it-IT"/>
               </w:rPr>
-              <w:t xml:space="preserve">SMS a </w:t>
-            </w:r>
-            <w:proofErr w:type="spellStart"/>
-            <w:r>
-              <w:rPr>
-                <w:rFonts w:ascii="Arial" w:eastAsia="Times New Roman" w:hAnsi="Arial" w:cs="Arial"/>
-                <w:sz w:val="16"/>
-                <w:szCs w:val="16"/>
-                <w:lang w:val="en-US" w:eastAsia="it-IT"/>
-              </w:rPr>
-              <w:t>Richiedente</w:t>
-            </w:r>
-            <w:proofErr w:type="spellEnd"/>
-            <w:r>
-              <w:rPr>
-                <w:rFonts w:ascii="Arial" w:eastAsia="Times New Roman" w:hAnsi="Arial" w:cs="Arial"/>
-                <w:sz w:val="16"/>
-                <w:szCs w:val="16"/>
-                <w:lang w:val="en-US" w:eastAsia="it-IT"/>
-              </w:rPr>
-              <w:t xml:space="preserve">; </w:t>
+              <w:t xml:space="preserve">SMS a Richiedente; </w:t>
             </w:r>
             <w:r>
               <w:rPr>
@@ -15588,25 +14793,14 @@
                 <w:lang w:val="en-US" w:eastAsia="it-IT"/>
               </w:rPr>
             </w:pPr>
-            <w:proofErr w:type="spellStart"/>
-            <w:r>
-              <w:rPr>
-                <w:rFonts w:ascii="Arial" w:eastAsia="Times New Roman" w:hAnsi="Arial" w:cs="Arial"/>
-                <w:sz w:val="16"/>
-                <w:szCs w:val="16"/>
-                <w:lang w:eastAsia="it-IT"/>
-              </w:rPr>
-              <w:t>Operation</w:t>
-            </w:r>
-            <w:proofErr w:type="spellEnd"/>
-            <w:r>
-              <w:rPr>
-                <w:rFonts w:ascii="Arial" w:eastAsia="Times New Roman" w:hAnsi="Arial" w:cs="Arial"/>
-                <w:sz w:val="16"/>
-                <w:szCs w:val="16"/>
-                <w:lang w:eastAsia="it-IT"/>
-              </w:rPr>
-              <w:t xml:space="preserve"> SET</w:t>
+            <w:r>
+              <w:rPr>
+                <w:rFonts w:ascii="Arial" w:eastAsia="Times New Roman" w:hAnsi="Arial" w:cs="Arial"/>
+                <w:sz w:val="16"/>
+                <w:szCs w:val="16"/>
+                <w:lang w:eastAsia="it-IT"/>
+              </w:rPr>
+              <w:t>Operation SET</w:t>
             </w:r>
           </w:p>
         </w:tc>
@@ -16123,25 +15317,14 @@
                 <w:lang w:eastAsia="it-IT"/>
               </w:rPr>
             </w:pPr>
-            <w:proofErr w:type="spellStart"/>
-            <w:r>
-              <w:rPr>
-                <w:rFonts w:ascii="Arial" w:eastAsia="Times New Roman" w:hAnsi="Arial" w:cs="Arial"/>
-                <w:sz w:val="16"/>
-                <w:szCs w:val="16"/>
-                <w:lang w:eastAsia="it-IT"/>
-              </w:rPr>
-              <w:t>Factory</w:t>
-            </w:r>
-            <w:proofErr w:type="spellEnd"/>
-            <w:r>
-              <w:rPr>
-                <w:rFonts w:ascii="Arial" w:eastAsia="Times New Roman" w:hAnsi="Arial" w:cs="Arial"/>
-                <w:sz w:val="16"/>
-                <w:szCs w:val="16"/>
-                <w:lang w:eastAsia="it-IT"/>
-              </w:rPr>
-              <w:t xml:space="preserve"> Reset</w:t>
+            <w:r>
+              <w:rPr>
+                <w:rFonts w:ascii="Arial" w:eastAsia="Times New Roman" w:hAnsi="Arial" w:cs="Arial"/>
+                <w:sz w:val="16"/>
+                <w:szCs w:val="16"/>
+                <w:lang w:eastAsia="it-IT"/>
+              </w:rPr>
+              <w:t>Factory Reset</w:t>
             </w:r>
           </w:p>
         </w:tc>
@@ -16353,7 +15536,7 @@
                     <pic:cNvPicPr/>
                   </pic:nvPicPr>
                   <pic:blipFill>
-                    <a:blip r:embed="rId8"/>
+                    <a:blip r:embed="rId11"/>
                     <a:stretch>
                       <a:fillRect/>
                     </a:stretch>
@@ -16753,7 +15936,6 @@
               </w:rPr>
               <w:t xml:space="preserve">Reset giornaliero </w:t>
             </w:r>
-            <w:proofErr w:type="spellStart"/>
             <w:r>
               <w:rPr>
                 <w:rFonts w:ascii="Courier New" w:eastAsia="Times New Roman" w:hAnsi="Courier New" w:cs="Courier New"/>
@@ -16761,17 +15943,7 @@
                 <w:szCs w:val="20"/>
                 <w:lang w:eastAsia="it-IT"/>
               </w:rPr>
-              <w:t>initapp</w:t>
-            </w:r>
-            <w:proofErr w:type="spellEnd"/>
-            <w:r>
-              <w:rPr>
-                <w:rFonts w:ascii="Courier New" w:eastAsia="Times New Roman" w:hAnsi="Courier New" w:cs="Courier New"/>
-                <w:sz w:val="20"/>
-                <w:szCs w:val="20"/>
-                <w:lang w:eastAsia="it-IT"/>
-              </w:rPr>
-              <w:t>()</w:t>
+              <w:t>initapp()</w:t>
             </w:r>
           </w:p>
         </w:tc>
@@ -17092,7 +16264,6 @@
           <w:lang w:val="en-US" w:eastAsia="it-IT"/>
         </w:rPr>
       </w:pPr>
-      <w:proofErr w:type="spellStart"/>
       <w:r>
         <w:rPr>
           <w:rFonts w:ascii="Consolas" w:eastAsia="Times New Roman" w:hAnsi="Consolas" w:cs="Times New Roman"/>
@@ -17103,7 +16274,6 @@
         </w:rPr>
         <w:t>EStr</w:t>
       </w:r>
-      <w:proofErr w:type="spellEnd"/>
       <w:r>
         <w:rPr>
           <w:rFonts w:ascii="Consolas" w:eastAsia="Times New Roman" w:hAnsi="Consolas" w:cs="Times New Roman"/>
@@ -17195,7 +16365,6 @@
         </w:rPr>
         <w:t xml:space="preserve"> </w:t>
       </w:r>
-      <w:proofErr w:type="spellStart"/>
       <w:r>
         <w:rPr>
           <w:rFonts w:ascii="Consolas" w:eastAsia="Times New Roman" w:hAnsi="Consolas" w:cs="Times New Roman"/>
@@ -17206,7 +16375,6 @@
         </w:rPr>
         <w:t>phoneAut</w:t>
       </w:r>
-      <w:proofErr w:type="spellEnd"/>
       <w:r>
         <w:rPr>
           <w:rFonts w:ascii="Consolas" w:eastAsia="Times New Roman" w:hAnsi="Consolas" w:cs="Times New Roman"/>
@@ -17508,29 +16676,20 @@
           <w:lang w:val="en-US"/>
         </w:rPr>
       </w:pPr>
-      <w:proofErr w:type="spellStart"/>
       <w:r>
         <w:rPr>
           <w:rFonts w:ascii="Arial" w:hAnsi="Arial" w:cs="Arial"/>
           <w:lang w:val="en-US"/>
         </w:rPr>
-        <w:t>phoneAut</w:t>
-      </w:r>
-      <w:proofErr w:type="spellEnd"/>
-      <w:r>
+        <w:t>phoneAut 15 char+”/0” =&gt; 16 char</w:t>
+      </w:r>
+    </w:p>
+    <w:p>
+      <w:pPr>
         <w:rPr>
           <w:rFonts w:ascii="Arial" w:hAnsi="Arial" w:cs="Arial"/>
           <w:lang w:val="en-US"/>
         </w:rPr>
-        <w:t xml:space="preserve"> 15 char+”/0” =&gt; 16 char</w:t>
-      </w:r>
-    </w:p>
-    <w:p>
-      <w:pPr>
-        <w:rPr>
-          <w:rFonts w:ascii="Arial" w:hAnsi="Arial" w:cs="Arial"/>
-          <w:lang w:val="en-US"/>
-        </w:rPr>
       </w:pPr>
     </w:p>
     <w:p>
@@ -17555,7 +16714,6 @@
         </w:rPr>
         <w:t> </w:t>
       </w:r>
-      <w:proofErr w:type="spellStart"/>
       <w:r>
         <w:rPr>
           <w:rFonts w:ascii="Consolas" w:eastAsia="Times New Roman" w:hAnsi="Consolas" w:cs="Times New Roman"/>
@@ -17566,7 +16724,6 @@
         </w:rPr>
         <w:t>writeString</w:t>
       </w:r>
-      <w:proofErr w:type="spellEnd"/>
       <w:r>
         <w:rPr>
           <w:rFonts w:ascii="Consolas" w:eastAsia="Times New Roman" w:hAnsi="Consolas" w:cs="Times New Roman"/>
@@ -17694,7 +16851,6 @@
           <w:rFonts w:ascii="Arial" w:hAnsi="Arial" w:cs="Arial"/>
         </w:rPr>
       </w:pPr>
-      <w:proofErr w:type="spellStart"/>
       <w:r>
         <w:rPr>
           <w:rFonts w:ascii="Consolas" w:eastAsia="Times New Roman" w:hAnsi="Consolas" w:cs="Times New Roman"/>
@@ -17702,17 +16858,7 @@
           <w:szCs w:val="24"/>
           <w:lang w:eastAsia="it-IT"/>
         </w:rPr>
-        <w:t>writeString</w:t>
-      </w:r>
-      <w:proofErr w:type="spellEnd"/>
-      <w:r>
-        <w:rPr>
-          <w:rFonts w:ascii="Consolas" w:eastAsia="Times New Roman" w:hAnsi="Consolas" w:cs="Times New Roman"/>
-          <w:sz w:val="24"/>
-          <w:szCs w:val="24"/>
-          <w:lang w:eastAsia="it-IT"/>
-        </w:rPr>
-        <w:t>((6+i*17), "");  </w:t>
+        <w:t>writeString((6+i*17), "");  </w:t>
       </w:r>
     </w:p>
     <w:p>
@@ -18066,14 +17212,12 @@
           <w:rFonts w:ascii="Arial" w:hAnsi="Arial" w:cs="Arial"/>
         </w:rPr>
       </w:pPr>
-      <w:proofErr w:type="spellStart"/>
       <w:r>
         <w:rPr>
           <w:rFonts w:ascii="Arial" w:hAnsi="Arial" w:cs="Arial"/>
         </w:rPr>
         <w:t>EStr</w:t>
       </w:r>
-      <w:proofErr w:type="spellEnd"/>
     </w:p>
     <w:p>
       <w:pPr>
@@ -18081,14 +17225,12 @@
           <w:rFonts w:ascii="Arial" w:hAnsi="Arial" w:cs="Arial"/>
         </w:rPr>
       </w:pPr>
-      <w:proofErr w:type="spellStart"/>
       <w:r>
         <w:rPr>
           <w:rFonts w:ascii="Arial" w:hAnsi="Arial" w:cs="Arial"/>
         </w:rPr>
         <w:t>phoneAuth</w:t>
       </w:r>
-      <w:proofErr w:type="spellEnd"/>
     </w:p>
     <w:p>
       <w:pPr>

</xml_diff>